<commit_message>
Document mobile and desktop upload flows
</commit_message>
<xml_diff>
--- a/docs/simple-drive-link-implementation.docx
+++ b/docs/simple-drive-link-implementation.docx
@@ -2,7 +2,7 @@
 <file path=word/document.xml><?xml version="1.0" encoding="utf-8"?>
 <w:document xmlns:w="http://schemas.openxmlformats.org/wordprocessingml/2006/main" xmlns:m="http://schemas.openxmlformats.org/officeDocument/2006/math" xmlns:r="http://schemas.openxmlformats.org/officeDocument/2006/relationships" xmlns:o="urn:schemas-microsoft-com:office:office" xmlns:v="urn:schemas-microsoft-com:vml" xmlns:w10="urn:schemas-microsoft-com:office:word" xmlns:a="http://schemas.openxmlformats.org/drawingml/2006/main" xmlns:pic="http://schemas.openxmlformats.org/drawingml/2006/picture" xmlns:wp="http://schemas.openxmlformats.org/drawingml/2006/wordprocessingDrawing">
   <w:body>
-    <w:bookmarkStart w:id="49" w:name="最简-drive-链接上传方案实现说明"/>
+    <w:bookmarkStart w:id="54" w:name="最简-drive-链接上传方案实现说明"/>
     <w:p>
       <w:pPr>
         <w:pStyle w:val="Heading1"/>
@@ -16,7 +16,7 @@
         <w:pStyle w:val="FirstParagraph"/>
       </w:pPr>
       <w:r>
-        <w:t xml:space="preserve">更新时间：2026-06-26</w:t>
+        <w:t xml:space="preserve">更新时间：2026-06-27</w:t>
       </w:r>
     </w:p>
     <w:p>
@@ -100,7 +100,16 @@
         <w:rPr>
           <w:rStyle w:val="VerbatimChar"/>
         </w:rPr>
-        <w:t xml:space="preserve">-&gt; 用户在 Google Drive 文件夹中上传视频</w:t>
+        <w:t xml:space="preserve">-&gt; PC 用户通过 Google Drive 文件夹链接上传视频</w:t>
+      </w:r>
+      <w:r>
+        <w:br/>
+      </w:r>
+      <w:r>
+        <w:rPr>
+          <w:rStyle w:val="VerbatimChar"/>
+        </w:rPr>
+        <w:t xml:space="preserve">-&gt; Mobile 用户使用 Google Drive App，在“与我共享”中找到共享文件夹上传视频</w:t>
       </w:r>
       <w:r>
         <w:br/>
@@ -451,7 +460,7 @@
         <w:rPr>
           <w:rStyle w:val="VerbatimChar"/>
         </w:rPr>
-        <w:t xml:space="preserve">https://script.google.com/macros/s/AKfycbxiz_N_y3gXPnbi2l98tdNQZioee4eNLC0_LSSivlHUT93Y0O2tQTk4ZVFSNcIqeAoN/exec</w:t>
+        <w:t xml:space="preserve">https://script.google.com/macros/s/AKfycbyVAcJZKv-wesuIqbSS_YTjBOpj93EpdPWH6rBli61d71wCw0da1Myl5ahgCX6TBo9R/exec</w:t>
       </w:r>
     </w:p>
     <w:p>
@@ -613,7 +622,7 @@
       </w:r>
     </w:p>
     <w:bookmarkEnd w:id="27"/>
-    <w:bookmarkStart w:id="28" w:name="四当前网页用户流程"/>
+    <w:bookmarkStart w:id="31" w:name="四当前网页用户流程"/>
     <w:p>
       <w:pPr>
         <w:pStyle w:val="Heading2"/>
@@ -646,7 +655,28 @@
         <w:pStyle w:val="FirstParagraph"/>
       </w:pPr>
       <w:r>
-        <w:t xml:space="preserve">页面流程：</w:t>
+        <w:t xml:space="preserve">页面会自动区分 PC 端和 Mobile 端。区分依据包括浏览器</w:t>
+      </w:r>
+      <w:r>
+        <w:t xml:space="preserve"> </w:t>
+      </w:r>
+      <w:r>
+        <w:rPr>
+          <w:rStyle w:val="VerbatimChar"/>
+        </w:rPr>
+        <w:t xml:space="preserve">userAgent</w:t>
+      </w:r>
+      <w:r>
+        <w:t xml:space="preserve">、触屏指针特征、屏幕宽度以及 iPad 类设备特征。</w:t>
+      </w:r>
+    </w:p>
+    <w:bookmarkStart w:id="28" w:name="pc-端流程"/>
+    <w:p>
+      <w:pPr>
+        <w:pStyle w:val="Heading3"/>
+      </w:pPr>
+      <w:r>
+        <w:t xml:space="preserve">1. PC 端流程</w:t>
       </w:r>
     </w:p>
     <w:p>
@@ -693,74 +723,385 @@
         <w:rPr>
           <w:rStyle w:val="VerbatimChar"/>
         </w:rPr>
-        <w:t xml:space="preserve">5. 前端显示 Submission ID 和“打开上传链接”按钮。</w:t>
-      </w:r>
-      <w:r>
-        <w:br/>
-      </w:r>
-      <w:r>
-        <w:rPr>
-          <w:rStyle w:val="VerbatimChar"/>
-        </w:rPr>
-        <w:t xml:space="preserve">6. “我已完成上传”按钮默认灰色且不可点击。</w:t>
-      </w:r>
-      <w:r>
-        <w:br/>
-      </w:r>
-      <w:r>
-        <w:rPr>
-          <w:rStyle w:val="VerbatimChar"/>
-        </w:rPr>
-        <w:t xml:space="preserve">7. 用户点击“打开上传链接”后进入 Google Drive 文件夹上传视频。</w:t>
-      </w:r>
-      <w:r>
-        <w:br/>
-      </w:r>
-      <w:r>
-        <w:rPr>
-          <w:rStyle w:val="VerbatimChar"/>
-        </w:rPr>
-        <w:t xml:space="preserve">8. 点击过上传链接后，“我已完成上传”按钮变为可点击。</w:t>
-      </w:r>
-      <w:r>
-        <w:br/>
-      </w:r>
-      <w:r>
-        <w:rPr>
-          <w:rStyle w:val="VerbatimChar"/>
-        </w:rPr>
-        <w:t xml:space="preserve">9. 用户上传视频后回到网页，点击“我已完成上传”。</w:t>
-      </w:r>
-      <w:r>
-        <w:br/>
-      </w:r>
-      <w:r>
-        <w:rPr>
-          <w:rStyle w:val="VerbatimChar"/>
-        </w:rPr>
-        <w:t xml:space="preserve">10. Apps Script 更新 Google Sheet 状态，并扫描/标注 Drive 文件。</w:t>
-      </w:r>
-      <w:r>
-        <w:br/>
-      </w:r>
-      <w:r>
-        <w:rPr>
-          <w:rStyle w:val="VerbatimChar"/>
-        </w:rPr>
-        <w:t xml:space="preserve">11. “我已完成上传”再次变为灰色不可点击。</w:t>
-      </w:r>
-      <w:r>
-        <w:br/>
-      </w:r>
-      <w:r>
-        <w:rPr>
-          <w:rStyle w:val="VerbatimChar"/>
-        </w:rPr>
-        <w:t xml:space="preserve">12. 上传链接按钮变为“继续上传”，继续打开同一个 Drive 文件夹。</w:t>
+        <w:t xml:space="preserve">5. Apps Script 将子文件夹设置为“知道链接的任何人可编辑”，并尝试共享给表单邮箱。</w:t>
+      </w:r>
+      <w:r>
+        <w:br/>
+      </w:r>
+      <w:r>
+        <w:rPr>
+          <w:rStyle w:val="VerbatimChar"/>
+        </w:rPr>
+        <w:t xml:space="preserve">6. 前端显示 Submission ID 和“打开上传链接”按钮。</w:t>
+      </w:r>
+      <w:r>
+        <w:br/>
+      </w:r>
+      <w:r>
+        <w:rPr>
+          <w:rStyle w:val="VerbatimChar"/>
+        </w:rPr>
+        <w:t xml:space="preserve">7. “我已完成上传”按钮默认灰色且不可点击。</w:t>
+      </w:r>
+      <w:r>
+        <w:br/>
+      </w:r>
+      <w:r>
+        <w:rPr>
+          <w:rStyle w:val="VerbatimChar"/>
+        </w:rPr>
+        <w:t xml:space="preserve">8. 用户点击“打开上传链接”后进入 Google Drive 文件夹上传视频。</w:t>
+      </w:r>
+      <w:r>
+        <w:br/>
+      </w:r>
+      <w:r>
+        <w:rPr>
+          <w:rStyle w:val="VerbatimChar"/>
+        </w:rPr>
+        <w:t xml:space="preserve">9. 点击过上传链接后，“我已完成上传”按钮变为可点击。</w:t>
+      </w:r>
+      <w:r>
+        <w:br/>
+      </w:r>
+      <w:r>
+        <w:rPr>
+          <w:rStyle w:val="VerbatimChar"/>
+        </w:rPr>
+        <w:t xml:space="preserve">10. 用户上传视频后回到网页，点击“我已完成上传”。</w:t>
+      </w:r>
+      <w:r>
+        <w:br/>
+      </w:r>
+      <w:r>
+        <w:rPr>
+          <w:rStyle w:val="VerbatimChar"/>
+        </w:rPr>
+        <w:t xml:space="preserve">11. Apps Script 更新 Google Sheet 状态，并扫描/标注 Drive 文件。</w:t>
+      </w:r>
+      <w:r>
+        <w:br/>
+      </w:r>
+      <w:r>
+        <w:rPr>
+          <w:rStyle w:val="VerbatimChar"/>
+        </w:rPr>
+        <w:t xml:space="preserve">12. “我已完成上传”再次变为灰色不可点击。</w:t>
+      </w:r>
+      <w:r>
+        <w:br/>
+      </w:r>
+      <w:r>
+        <w:rPr>
+          <w:rStyle w:val="VerbatimChar"/>
+        </w:rPr>
+        <w:t xml:space="preserve">13. 上传链接按钮变为“继续上传”，继续打开同一个 Drive 文件夹。</w:t>
       </w:r>
     </w:p>
     <w:bookmarkEnd w:id="28"/>
-    <w:bookmarkStart w:id="34" w:name="五前端交互细节"/>
+    <w:bookmarkStart w:id="29" w:name="mobile-端流程"/>
+    <w:p>
+      <w:pPr>
+        <w:pStyle w:val="Heading3"/>
+      </w:pPr>
+      <w:r>
+        <w:t xml:space="preserve">2. Mobile 端流程</w:t>
+      </w:r>
+    </w:p>
+    <w:p>
+      <w:pPr>
+        <w:pStyle w:val="FirstParagraph"/>
+      </w:pPr>
+      <w:r>
+        <w:t xml:space="preserve">经过测试，手机端直接打开 Google Drive 文件夹网页链接时，尤其是在微信内置浏览器中，容易只显示</w:t>
+      </w:r>
+      <w:r>
+        <w:t xml:space="preserve">“</w:t>
+      </w:r>
+      <w:r>
+        <w:t xml:space="preserve">没有内容</w:t>
+      </w:r>
+      <w:r>
+        <w:t xml:space="preserve">”</w:t>
+      </w:r>
+      <w:r>
+        <w:t xml:space="preserve">，并且看不到稳定的上传入口。因此当前 Mobile 端不再主推网页链接上传，而是引导用户使用 Google Drive App。</w:t>
+      </w:r>
+    </w:p>
+    <w:p>
+      <w:pPr>
+        <w:pStyle w:val="SourceCode"/>
+      </w:pPr>
+      <w:r>
+        <w:rPr>
+          <w:rStyle w:val="VerbatimChar"/>
+        </w:rPr>
+        <w:t xml:space="preserve">1. 页面提示：NOTE: 建议使用 PC 端，操作更方便。</w:t>
+      </w:r>
+      <w:r>
+        <w:br/>
+      </w:r>
+      <w:r>
+        <w:rPr>
+          <w:rStyle w:val="VerbatimChar"/>
+        </w:rPr>
+        <w:t xml:space="preserve">2. 用户填写姓名、机构/组织、邮箱、国家/地区、其他说明。</w:t>
+      </w:r>
+      <w:r>
+        <w:br/>
+      </w:r>
+      <w:r>
+        <w:rPr>
+          <w:rStyle w:val="VerbatimChar"/>
+        </w:rPr>
+        <w:t xml:space="preserve">3. Mobile 端强制要求邮箱为 Gmail 地址，例如 yourname@gmail.com。</w:t>
+      </w:r>
+      <w:r>
+        <w:br/>
+      </w:r>
+      <w:r>
+        <w:rPr>
+          <w:rStyle w:val="VerbatimChar"/>
+        </w:rPr>
+        <w:t xml:space="preserve">4. 该 Gmail 应为手机 Google Drive App 当前登录账号。</w:t>
+      </w:r>
+      <w:r>
+        <w:br/>
+      </w:r>
+      <w:r>
+        <w:rPr>
+          <w:rStyle w:val="VerbatimChar"/>
+        </w:rPr>
+        <w:t xml:space="preserve">5. 用户点击“提交信息并共享文件夹”。</w:t>
+      </w:r>
+      <w:r>
+        <w:br/>
+      </w:r>
+      <w:r>
+        <w:rPr>
+          <w:rStyle w:val="VerbatimChar"/>
+        </w:rPr>
+        <w:t xml:space="preserve">6. Apps Script 创建 Drive 子文件夹。</w:t>
+      </w:r>
+      <w:r>
+        <w:br/>
+      </w:r>
+      <w:r>
+        <w:rPr>
+          <w:rStyle w:val="VerbatimChar"/>
+        </w:rPr>
+        <w:t xml:space="preserve">7. Apps Script 将该子文件夹设置为“知道链接的任何人可编辑”。</w:t>
+      </w:r>
+      <w:r>
+        <w:br/>
+      </w:r>
+      <w:r>
+        <w:rPr>
+          <w:rStyle w:val="VerbatimChar"/>
+        </w:rPr>
+        <w:t xml:space="preserve">8. Apps Script 额外执行 folder.addEditor(email)，把子文件夹直接共享给用户填写的 Gmail。</w:t>
+      </w:r>
+      <w:r>
+        <w:br/>
+      </w:r>
+      <w:r>
+        <w:rPr>
+          <w:rStyle w:val="VerbatimChar"/>
+        </w:rPr>
+        <w:t xml:space="preserve">9. Apps Script 尝试向该 Gmail 发送包含上传文件夹链接的邮件。</w:t>
+      </w:r>
+      <w:r>
+        <w:br/>
+      </w:r>
+      <w:r>
+        <w:rPr>
+          <w:rStyle w:val="VerbatimChar"/>
+        </w:rPr>
+        <w:t xml:space="preserve">10. 前端显示 Submission ID 和 Google Drive App 操作步骤。</w:t>
+      </w:r>
+      <w:r>
+        <w:br/>
+      </w:r>
+      <w:r>
+        <w:rPr>
+          <w:rStyle w:val="VerbatimChar"/>
+        </w:rPr>
+        <w:t xml:space="preserve">11. Mobile 端不显示“打开上传链接”“复制链接”等按钮，避免误导用户去手机网页上传。</w:t>
+      </w:r>
+      <w:r>
+        <w:br/>
+      </w:r>
+      <w:r>
+        <w:rPr>
+          <w:rStyle w:val="VerbatimChar"/>
+        </w:rPr>
+        <w:t xml:space="preserve">12. 用户打开 Google Drive App，并确认登录的是刚才填写的 Gmail。</w:t>
+      </w:r>
+      <w:r>
+        <w:br/>
+      </w:r>
+      <w:r>
+        <w:rPr>
+          <w:rStyle w:val="VerbatimChar"/>
+        </w:rPr>
+        <w:t xml:space="preserve">13. 用户进入“与我共享”，找到最新共享的上传文件夹。</w:t>
+      </w:r>
+      <w:r>
+        <w:br/>
+      </w:r>
+      <w:r>
+        <w:rPr>
+          <w:rStyle w:val="VerbatimChar"/>
+        </w:rPr>
+        <w:t xml:space="preserve">14. 用户进入该文件夹后点击 + / 上传，选择一个或多个视频。</w:t>
+      </w:r>
+      <w:r>
+        <w:br/>
+      </w:r>
+      <w:r>
+        <w:rPr>
+          <w:rStyle w:val="VerbatimChar"/>
+        </w:rPr>
+        <w:t xml:space="preserve">15. 上传完成后回到网页，点击“我已完成上传”。</w:t>
+      </w:r>
+      <w:r>
+        <w:br/>
+      </w:r>
+      <w:r>
+        <w:rPr>
+          <w:rStyle w:val="VerbatimChar"/>
+        </w:rPr>
+        <w:t xml:space="preserve">16. Apps Script 更新 Google Sheet 状态，并扫描/标注 Drive 文件。</w:t>
+      </w:r>
+    </w:p>
+    <w:p>
+      <w:pPr>
+        <w:pStyle w:val="FirstParagraph"/>
+      </w:pPr>
+      <w:r>
+        <w:t xml:space="preserve">Mobile 端提交成功后，如果 Apps Script 返回的</w:t>
+      </w:r>
+      <w:r>
+        <w:t xml:space="preserve"> </w:t>
+      </w:r>
+      <w:r>
+        <w:rPr>
+          <w:rStyle w:val="VerbatimChar"/>
+        </w:rPr>
+        <w:t xml:space="preserve">sharingNote</w:t>
+      </w:r>
+      <w:r>
+        <w:t xml:space="preserve"> </w:t>
+      </w:r>
+      <w:r>
+        <w:t xml:space="preserve">中包含：</w:t>
+      </w:r>
+    </w:p>
+    <w:p>
+      <w:pPr>
+        <w:pStyle w:val="SourceCode"/>
+      </w:pPr>
+      <w:r>
+        <w:rPr>
+          <w:rStyle w:val="VerbatimChar"/>
+        </w:rPr>
+        <w:t xml:space="preserve">direct_email_share_added</w:t>
+      </w:r>
+    </w:p>
+    <w:p>
+      <w:pPr>
+        <w:pStyle w:val="FirstParagraph"/>
+      </w:pPr>
+      <w:r>
+        <w:t xml:space="preserve">页面会提示：</w:t>
+      </w:r>
+    </w:p>
+    <w:p>
+      <w:pPr>
+        <w:pStyle w:val="SourceCode"/>
+      </w:pPr>
+      <w:r>
+        <w:rPr>
+          <w:rStyle w:val="VerbatimChar"/>
+        </w:rPr>
+        <w:t xml:space="preserve">信息已提交，上传文件夹已共享到你的 Gmail。请打开 Google Drive App，在“与我共享”中找到最新共享文件夹并上传。</w:t>
+      </w:r>
+    </w:p>
+    <w:p>
+      <w:pPr>
+        <w:pStyle w:val="FirstParagraph"/>
+      </w:pPr>
+      <w:r>
+        <w:t xml:space="preserve">如果没有检测到上述共享成功标记，页面会提示用户稍后刷新 Google Drive App 或检查 Gmail 是否正确。</w:t>
+      </w:r>
+    </w:p>
+    <w:bookmarkEnd w:id="29"/>
+    <w:bookmarkStart w:id="30" w:name="旧版统一流程说明"/>
+    <w:p>
+      <w:pPr>
+        <w:pStyle w:val="Heading3"/>
+      </w:pPr>
+      <w:r>
+        <w:t xml:space="preserve">3. 旧版统一流程说明</w:t>
+      </w:r>
+    </w:p>
+    <w:p>
+      <w:pPr>
+        <w:pStyle w:val="FirstParagraph"/>
+      </w:pPr>
+      <w:r>
+        <w:t xml:space="preserve">早期版本中，PC 和 Mobile 使用相同流程：</w:t>
+      </w:r>
+    </w:p>
+    <w:p>
+      <w:pPr>
+        <w:pStyle w:val="SourceCode"/>
+      </w:pPr>
+      <w:r>
+        <w:rPr>
+          <w:rStyle w:val="VerbatimChar"/>
+        </w:rPr>
+        <w:t xml:space="preserve">1. 提交信息。</w:t>
+      </w:r>
+      <w:r>
+        <w:br/>
+      </w:r>
+      <w:r>
+        <w:rPr>
+          <w:rStyle w:val="VerbatimChar"/>
+        </w:rPr>
+        <w:t xml:space="preserve">2. 页面显示上传链接。</w:t>
+      </w:r>
+      <w:r>
+        <w:br/>
+      </w:r>
+      <w:r>
+        <w:rPr>
+          <w:rStyle w:val="VerbatimChar"/>
+        </w:rPr>
+        <w:t xml:space="preserve">3. 用户打开 Drive 链接上传。</w:t>
+      </w:r>
+      <w:r>
+        <w:br/>
+      </w:r>
+      <w:r>
+        <w:rPr>
+          <w:rStyle w:val="VerbatimChar"/>
+        </w:rPr>
+        <w:t xml:space="preserve">4. 回到页面确认完成。</w:t>
+      </w:r>
+    </w:p>
+    <w:p>
+      <w:pPr>
+        <w:pStyle w:val="FirstParagraph"/>
+      </w:pPr>
+      <w:r>
+        <w:t xml:space="preserve">该流程对 PC 端仍然适用，但不再作为 Mobile 端主流程。</w:t>
+      </w:r>
+    </w:p>
+    <w:bookmarkEnd w:id="30"/>
+    <w:bookmarkEnd w:id="31"/>
+    <w:bookmarkStart w:id="38" w:name="五前端交互细节"/>
     <w:p>
       <w:pPr>
         <w:pStyle w:val="Heading2"/>
@@ -769,13 +1110,13 @@
         <w:t xml:space="preserve">五、前端交互细节</w:t>
       </w:r>
     </w:p>
-    <w:bookmarkStart w:id="29" w:name="必填项"/>
+    <w:bookmarkStart w:id="32" w:name="必填项和邮箱校验"/>
     <w:p>
       <w:pPr>
         <w:pStyle w:val="Heading3"/>
       </w:pPr>
       <w:r>
-        <w:t xml:space="preserve">1. 必填项</w:t>
+        <w:t xml:space="preserve">1. 必填项和邮箱校验</w:t>
       </w:r>
     </w:p>
     <w:p>
@@ -839,14 +1180,244 @@
         <w:t xml:space="preserve">国家或地区 / Countries</w:t>
       </w:r>
     </w:p>
-    <w:bookmarkEnd w:id="29"/>
-    <w:bookmarkStart w:id="30" w:name="提交按钮"/>
+    <w:p>
+      <w:pPr>
+        <w:pStyle w:val="FirstParagraph"/>
+      </w:pPr>
+      <w:r>
+        <w:t xml:space="preserve">PC 端邮箱项不显示额外提示词，用户可以填写常用邮箱。</w:t>
+      </w:r>
+    </w:p>
+    <w:p>
+      <w:pPr>
+        <w:pStyle w:val="BodyText"/>
+      </w:pPr>
+      <w:r>
+        <w:t xml:space="preserve">Mobile 端邮箱项显示 Gmail 要求，并强制校验：</w:t>
+      </w:r>
+    </w:p>
+    <w:p>
+      <w:pPr>
+        <w:pStyle w:val="SourceCode"/>
+      </w:pPr>
+      <w:r>
+        <w:rPr>
+          <w:rStyle w:val="VerbatimChar"/>
+        </w:rPr>
+        <w:t xml:space="preserve">邮箱必须是 @gmail.com 地址</w:t>
+      </w:r>
+      <w:r>
+        <w:br/>
+      </w:r>
+      <w:r>
+        <w:rPr>
+          <w:rStyle w:val="VerbatimChar"/>
+        </w:rPr>
+        <w:t xml:space="preserve">示例：yourname@gmail.com</w:t>
+      </w:r>
+    </w:p>
+    <w:p>
+      <w:pPr>
+        <w:pStyle w:val="FirstParagraph"/>
+      </w:pPr>
+      <w:r>
+        <w:t xml:space="preserve">如果 Mobile 端用户填写非 Gmail 邮箱，页面会阻止提交并提示：</w:t>
+      </w:r>
+    </w:p>
+    <w:p>
+      <w:pPr>
+        <w:pStyle w:val="SourceCode"/>
+      </w:pPr>
+      <w:r>
+        <w:rPr>
+          <w:rStyle w:val="VerbatimChar"/>
+        </w:rPr>
+        <w:t xml:space="preserve">手机端请填写有效的 Gmail 地址，例如 yourname@gmail.com</w:t>
+      </w:r>
+    </w:p>
+    <w:bookmarkEnd w:id="32"/>
+    <w:bookmarkStart w:id="33" w:name="pc-mobile-显示差异"/>
     <w:p>
       <w:pPr>
         <w:pStyle w:val="Heading3"/>
       </w:pPr>
       <w:r>
-        <w:t xml:space="preserve">2. 提交按钮</w:t>
+        <w:t xml:space="preserve">2. PC / Mobile 显示差异</w:t>
+      </w:r>
+    </w:p>
+    <w:p>
+      <w:pPr>
+        <w:pStyle w:val="FirstParagraph"/>
+      </w:pPr>
+      <w:r>
+        <w:t xml:space="preserve">PC 端：</w:t>
+      </w:r>
+    </w:p>
+    <w:p>
+      <w:pPr>
+        <w:pStyle w:val="SourceCode"/>
+      </w:pPr>
+      <w:r>
+        <w:rPr>
+          <w:rStyle w:val="VerbatimChar"/>
+        </w:rPr>
+        <w:t xml:space="preserve">1. 显示“打开上传链接”按钮。</w:t>
+      </w:r>
+      <w:r>
+        <w:br/>
+      </w:r>
+      <w:r>
+        <w:rPr>
+          <w:rStyle w:val="VerbatimChar"/>
+        </w:rPr>
+        <w:t xml:space="preserve">2. 显示“复制链接”按钮。</w:t>
+      </w:r>
+      <w:r>
+        <w:br/>
+      </w:r>
+      <w:r>
+        <w:rPr>
+          <w:rStyle w:val="VerbatimChar"/>
+        </w:rPr>
+        <w:t xml:space="preserve">3. “我已完成上传”按钮默认灰色。</w:t>
+      </w:r>
+      <w:r>
+        <w:br/>
+      </w:r>
+      <w:r>
+        <w:rPr>
+          <w:rStyle w:val="VerbatimChar"/>
+        </w:rPr>
+        <w:t xml:space="preserve">4. 只有点击过“打开上传链接”或“继续上传”后，才能点击“我已完成上传”。</w:t>
+      </w:r>
+      <w:r>
+        <w:br/>
+      </w:r>
+      <w:r>
+        <w:rPr>
+          <w:rStyle w:val="VerbatimChar"/>
+        </w:rPr>
+        <w:t xml:space="preserve">5. Countries 输入框在 PC 端占满一整行，便于输入和搜索国家/地区。</w:t>
+      </w:r>
+    </w:p>
+    <w:p>
+      <w:pPr>
+        <w:pStyle w:val="FirstParagraph"/>
+      </w:pPr>
+      <w:r>
+        <w:t xml:space="preserve">Mobile 端：</w:t>
+      </w:r>
+    </w:p>
+    <w:p>
+      <w:pPr>
+        <w:pStyle w:val="SourceCode"/>
+      </w:pPr>
+      <w:r>
+        <w:rPr>
+          <w:rStyle w:val="VerbatimChar"/>
+        </w:rPr>
+        <w:t xml:space="preserve">1. 显示 NOTE: 建议使用 PC 端，操作更方便。</w:t>
+      </w:r>
+      <w:r>
+        <w:br/>
+      </w:r>
+      <w:r>
+        <w:rPr>
+          <w:rStyle w:val="VerbatimChar"/>
+        </w:rPr>
+        <w:t xml:space="preserve">2. 显示 Gmail 要求。</w:t>
+      </w:r>
+      <w:r>
+        <w:br/>
+      </w:r>
+      <w:r>
+        <w:rPr>
+          <w:rStyle w:val="VerbatimChar"/>
+        </w:rPr>
+        <w:t xml:space="preserve">3. 提交后显示 Google Drive App 操作步骤。</w:t>
+      </w:r>
+      <w:r>
+        <w:br/>
+      </w:r>
+      <w:r>
+        <w:rPr>
+          <w:rStyle w:val="VerbatimChar"/>
+        </w:rPr>
+        <w:t xml:space="preserve">4. 不显示“打开上传链接”按钮。</w:t>
+      </w:r>
+      <w:r>
+        <w:br/>
+      </w:r>
+      <w:r>
+        <w:rPr>
+          <w:rStyle w:val="VerbatimChar"/>
+        </w:rPr>
+        <w:t xml:space="preserve">5. 不显示“复制链接”按钮。</w:t>
+      </w:r>
+      <w:r>
+        <w:br/>
+      </w:r>
+      <w:r>
+        <w:rPr>
+          <w:rStyle w:val="VerbatimChar"/>
+        </w:rPr>
+        <w:t xml:space="preserve">6. “我已完成上传”按钮在提交成功后可用，用户需完成 Drive App 上传后再点击。</w:t>
+      </w:r>
+    </w:p>
+    <w:p>
+      <w:pPr>
+        <w:pStyle w:val="FirstParagraph"/>
+      </w:pPr>
+      <w:r>
+        <w:t xml:space="preserve">Mobile 端隐藏链接按钮使用多层兜底：</w:t>
+      </w:r>
+    </w:p>
+    <w:p>
+      <w:pPr>
+        <w:pStyle w:val="SourceCode"/>
+      </w:pPr>
+      <w:r>
+        <w:rPr>
+          <w:rStyle w:val="VerbatimChar"/>
+        </w:rPr>
+        <w:t xml:space="preserve">1. HTML 给链接按钮添加 pc-upload-action 类。</w:t>
+      </w:r>
+      <w:r>
+        <w:br/>
+      </w:r>
+      <w:r>
+        <w:rPr>
+          <w:rStyle w:val="VerbatimChar"/>
+        </w:rPr>
+        <w:t xml:space="preserve">2. JavaScript 在 mobile 模式下设置 display: none。</w:t>
+      </w:r>
+      <w:r>
+        <w:br/>
+      </w:r>
+      <w:r>
+        <w:rPr>
+          <w:rStyle w:val="VerbatimChar"/>
+        </w:rPr>
+        <w:t xml:space="preserve">3. CSS 通过 body.is-mobile-flow 强制隐藏。</w:t>
+      </w:r>
+      <w:r>
+        <w:br/>
+      </w:r>
+      <w:r>
+        <w:rPr>
+          <w:rStyle w:val="VerbatimChar"/>
+        </w:rPr>
+        <w:t xml:space="preserve">4. CSS 通过小屏和触屏媒体查询再次兜底隐藏。</w:t>
+      </w:r>
+    </w:p>
+    <w:bookmarkEnd w:id="33"/>
+    <w:bookmarkStart w:id="34" w:name="提交按钮"/>
+    <w:p>
+      <w:pPr>
+        <w:pStyle w:val="Heading3"/>
+      </w:pPr>
+      <w:r>
+        <w:t xml:space="preserve">3. 提交按钮</w:t>
       </w:r>
     </w:p>
     <w:p>
@@ -865,7 +1436,16 @@
         <w:rPr>
           <w:rStyle w:val="VerbatimChar"/>
         </w:rPr>
-        <w:t xml:space="preserve">Submit details and get upload link</w:t>
+        <w:t xml:space="preserve">PC: Submit details and get upload link</w:t>
+      </w:r>
+      <w:r>
+        <w:br/>
+      </w:r>
+      <w:r>
+        <w:rPr>
+          <w:rStyle w:val="VerbatimChar"/>
+        </w:rPr>
+        <w:t xml:space="preserve">Mobile: Submit details and share folder</w:t>
       </w:r>
     </w:p>
     <w:p>
@@ -915,22 +1495,22 @@
         <w:t xml:space="preserve">按钮变为 Exit / 退出</w:t>
       </w:r>
     </w:p>
-    <w:bookmarkEnd w:id="30"/>
-    <w:bookmarkStart w:id="31" w:name="上传链接按钮"/>
+    <w:bookmarkEnd w:id="34"/>
+    <w:bookmarkStart w:id="35" w:name="上传链接按钮"/>
     <w:p>
       <w:pPr>
         <w:pStyle w:val="Heading3"/>
       </w:pPr>
       <w:r>
-        <w:t xml:space="preserve">3. 上传链接按钮</w:t>
-      </w:r>
-    </w:p>
-    <w:p>
-      <w:pPr>
-        <w:pStyle w:val="FirstParagraph"/>
-      </w:pPr>
-      <w:r>
-        <w:t xml:space="preserve">第一次提交成功后显示：</w:t>
+        <w:t xml:space="preserve">4. 上传链接按钮</w:t>
+      </w:r>
+    </w:p>
+    <w:p>
+      <w:pPr>
+        <w:pStyle w:val="FirstParagraph"/>
+      </w:pPr>
+      <w:r>
+        <w:t xml:space="preserve">PC 端第一次提交成功后显示：</w:t>
       </w:r>
     </w:p>
     <w:p>
@@ -983,14 +1563,22 @@
         <w:t xml:space="preserve">两个状态打开的都是同一个 Google Drive 子文件夹，不会新建提交记录。</w:t>
       </w:r>
     </w:p>
-    <w:bookmarkEnd w:id="31"/>
-    <w:bookmarkStart w:id="32" w:name="i-have-finished-uploading-按钮"/>
+    <w:p>
+      <w:pPr>
+        <w:pStyle w:val="BodyText"/>
+      </w:pPr>
+      <w:r>
+        <w:t xml:space="preserve">Mobile 端不显示上传链接按钮。</w:t>
+      </w:r>
+    </w:p>
+    <w:bookmarkEnd w:id="35"/>
+    <w:bookmarkStart w:id="36" w:name="i-have-finished-uploading-按钮"/>
     <w:p>
       <w:pPr>
         <w:pStyle w:val="Heading3"/>
       </w:pPr>
       <w:r>
-        <w:t xml:space="preserve">4.</w:t>
+        <w:t xml:space="preserve">5.</w:t>
       </w:r>
       <w:r>
         <w:t xml:space="preserve"> </w:t>
@@ -1016,7 +1604,7 @@
         <w:pStyle w:val="FirstParagraph"/>
       </w:pPr>
       <w:r>
-        <w:t xml:space="preserve">默认状态：</w:t>
+        <w:t xml:space="preserve">PC 端默认状态：</w:t>
       </w:r>
     </w:p>
     <w:p>
@@ -1098,22 +1686,68 @@
         <w:t xml:space="preserve">再次变为灰色，不可点击</w:t>
       </w:r>
     </w:p>
-    <w:bookmarkEnd w:id="32"/>
-    <w:bookmarkStart w:id="33" w:name="message-提示"/>
+    <w:p>
+      <w:pPr>
+        <w:pStyle w:val="FirstParagraph"/>
+      </w:pPr>
+      <w:r>
+        <w:t xml:space="preserve">Mobile 端：</w:t>
+      </w:r>
+    </w:p>
+    <w:p>
+      <w:pPr>
+        <w:pStyle w:val="SourceCode"/>
+      </w:pPr>
+      <w:r>
+        <w:rPr>
+          <w:rStyle w:val="VerbatimChar"/>
+        </w:rPr>
+        <w:t xml:space="preserve">提交成功后可点击。</w:t>
+      </w:r>
+      <w:r>
+        <w:br/>
+      </w:r>
+      <w:r>
+        <w:rPr>
+          <w:rStyle w:val="VerbatimChar"/>
+        </w:rPr>
+        <w:t xml:space="preserve">用户应先在 Google Drive App 的“与我共享”中找到最新共享文件夹并上传视频。</w:t>
+      </w:r>
+      <w:r>
+        <w:br/>
+      </w:r>
+      <w:r>
+        <w:rPr>
+          <w:rStyle w:val="VerbatimChar"/>
+        </w:rPr>
+        <w:t xml:space="preserve">上传完成后回到网页点击该按钮。</w:t>
+      </w:r>
+      <w:r>
+        <w:br/>
+      </w:r>
+      <w:r>
+        <w:rPr>
+          <w:rStyle w:val="VerbatimChar"/>
+        </w:rPr>
+        <w:t xml:space="preserve">点击确认完成并成功更新 Sheet 后，再次变为灰色不可点击。</w:t>
+      </w:r>
+    </w:p>
+    <w:bookmarkEnd w:id="36"/>
+    <w:bookmarkStart w:id="37" w:name="message-提示"/>
     <w:p>
       <w:pPr>
         <w:pStyle w:val="Heading3"/>
       </w:pPr>
       <w:r>
-        <w:t xml:space="preserve">5. Message 提示</w:t>
-      </w:r>
-    </w:p>
-    <w:p>
-      <w:pPr>
-        <w:pStyle w:val="FirstParagraph"/>
-      </w:pPr>
-      <w:r>
-        <w:t xml:space="preserve">成功提示已经简化为：</w:t>
+        <w:t xml:space="preserve">6. Message 提示</w:t>
+      </w:r>
+    </w:p>
+    <w:p>
+      <w:pPr>
+        <w:pStyle w:val="FirstParagraph"/>
+      </w:pPr>
+      <w:r>
+        <w:t xml:space="preserve">PC 端成功提示：</w:t>
       </w:r>
     </w:p>
     <w:p>
@@ -1151,6 +1785,44 @@
         <w:pStyle w:val="FirstParagraph"/>
       </w:pPr>
       <w:r>
+        <w:t xml:space="preserve">Mobile 端共享成功提示：</w:t>
+      </w:r>
+    </w:p>
+    <w:p>
+      <w:pPr>
+        <w:pStyle w:val="SourceCode"/>
+      </w:pPr>
+      <w:r>
+        <w:rPr>
+          <w:rStyle w:val="VerbatimChar"/>
+        </w:rPr>
+        <w:t xml:space="preserve">信息已提交，上传文件夹已共享到你的 Gmail。请打开 Google Drive App，在“与我共享”中找到最新共享文件夹并上传。</w:t>
+      </w:r>
+    </w:p>
+    <w:p>
+      <w:pPr>
+        <w:pStyle w:val="FirstParagraph"/>
+      </w:pPr>
+      <w:r>
+        <w:t xml:space="preserve">Mobile 端未检测到共享成功标记时：</w:t>
+      </w:r>
+    </w:p>
+    <w:p>
+      <w:pPr>
+        <w:pStyle w:val="SourceCode"/>
+      </w:pPr>
+      <w:r>
+        <w:rPr>
+          <w:rStyle w:val="VerbatimChar"/>
+        </w:rPr>
+        <w:t xml:space="preserve">信息已提交。请打开 Google Drive App，在“与我共享”中查找最新共享文件夹；如果暂时看不到，请稍后刷新或检查 Gmail 是否正确。</w:t>
+      </w:r>
+    </w:p>
+    <w:p>
+      <w:pPr>
+        <w:pStyle w:val="FirstParagraph"/>
+      </w:pPr>
+      <w:r>
         <w:t xml:space="preserve">提示区不再额外显示</w:t>
       </w:r>
       <w:r>
@@ -1175,616 +1847,820 @@
       </w:pPr>
       <w:r>
         <w:t xml:space="preserve">错误提示会用红色显示，例如网络异常、配置缺失、必填项缺失等。</w:t>
-      </w:r>
-    </w:p>
-    <w:bookmarkEnd w:id="33"/>
-    <w:bookmarkEnd w:id="34"/>
-    <w:bookmarkStart w:id="35" w:name="六google-sheet-表结构"/>
-    <w:p>
-      <w:pPr>
-        <w:pStyle w:val="Heading2"/>
-      </w:pPr>
-      <w:r>
-        <w:t xml:space="preserve">六、Google Sheet 表结构</w:t>
-      </w:r>
-    </w:p>
-    <w:p>
-      <w:pPr>
-        <w:pStyle w:val="FirstParagraph"/>
-      </w:pPr>
-      <w:r>
-        <w:rPr>
-          <w:rStyle w:val="VerbatimChar"/>
-        </w:rPr>
-        <w:t xml:space="preserve">Submissions</w:t>
-      </w:r>
-      <w:r>
-        <w:t xml:space="preserve"> </w:t>
-      </w:r>
-      <w:r>
-        <w:t xml:space="preserve">工作表当前字段：</w:t>
-      </w:r>
-    </w:p>
-    <w:p>
-      <w:pPr>
-        <w:pStyle w:val="SourceCode"/>
-      </w:pPr>
-      <w:r>
-        <w:rPr>
-          <w:rStyle w:val="VerbatimChar"/>
-        </w:rPr>
-        <w:t xml:space="preserve">submission_id</w:t>
-      </w:r>
-      <w:r>
-        <w:br/>
-      </w:r>
-      <w:r>
-        <w:rPr>
-          <w:rStyle w:val="VerbatimChar"/>
-        </w:rPr>
-        <w:t xml:space="preserve">submitted_at</w:t>
-      </w:r>
-      <w:r>
-        <w:br/>
-      </w:r>
-      <w:r>
-        <w:rPr>
-          <w:rStyle w:val="VerbatimChar"/>
-        </w:rPr>
-        <w:t xml:space="preserve">name</w:t>
-      </w:r>
-      <w:r>
-        <w:br/>
-      </w:r>
-      <w:r>
-        <w:rPr>
-          <w:rStyle w:val="VerbatimChar"/>
-        </w:rPr>
-        <w:t xml:space="preserve">organization</w:t>
-      </w:r>
-      <w:r>
-        <w:br/>
-      </w:r>
-      <w:r>
-        <w:rPr>
-          <w:rStyle w:val="VerbatimChar"/>
-        </w:rPr>
-        <w:t xml:space="preserve">email</w:t>
-      </w:r>
-      <w:r>
-        <w:br/>
-      </w:r>
-      <w:r>
-        <w:rPr>
-          <w:rStyle w:val="VerbatimChar"/>
-        </w:rPr>
-        <w:t xml:space="preserve">countries</w:t>
-      </w:r>
-      <w:r>
-        <w:br/>
-      </w:r>
-      <w:r>
-        <w:rPr>
-          <w:rStyle w:val="VerbatimChar"/>
-        </w:rPr>
-        <w:t xml:space="preserve">others</w:t>
-      </w:r>
-      <w:r>
-        <w:br/>
-      </w:r>
-      <w:r>
-        <w:rPr>
-          <w:rStyle w:val="VerbatimChar"/>
-        </w:rPr>
-        <w:t xml:space="preserve">folder_id</w:t>
-      </w:r>
-      <w:r>
-        <w:br/>
-      </w:r>
-      <w:r>
-        <w:rPr>
-          <w:rStyle w:val="VerbatimChar"/>
-        </w:rPr>
-        <w:t xml:space="preserve">folder_url</w:t>
-      </w:r>
-      <w:r>
-        <w:br/>
-      </w:r>
-      <w:r>
-        <w:rPr>
-          <w:rStyle w:val="VerbatimChar"/>
-        </w:rPr>
-        <w:t xml:space="preserve">status</w:t>
-      </w:r>
-      <w:r>
-        <w:br/>
-      </w:r>
-      <w:r>
-        <w:rPr>
-          <w:rStyle w:val="VerbatimChar"/>
-        </w:rPr>
-        <w:t xml:space="preserve">completed_at</w:t>
-      </w:r>
-      <w:r>
-        <w:br/>
-      </w:r>
-      <w:r>
-        <w:rPr>
-          <w:rStyle w:val="VerbatimChar"/>
-        </w:rPr>
-        <w:t xml:space="preserve">file_count</w:t>
-      </w:r>
-      <w:r>
-        <w:br/>
-      </w:r>
-      <w:r>
-        <w:rPr>
-          <w:rStyle w:val="VerbatimChar"/>
-        </w:rPr>
-        <w:t xml:space="preserve">upload_file_names</w:t>
-      </w:r>
-      <w:r>
-        <w:br/>
-      </w:r>
-      <w:r>
-        <w:rPr>
-          <w:rStyle w:val="VerbatimChar"/>
-        </w:rPr>
-        <w:t xml:space="preserve">annotated_at</w:t>
-      </w:r>
-      <w:r>
-        <w:br/>
-      </w:r>
-      <w:r>
-        <w:rPr>
-          <w:rStyle w:val="VerbatimChar"/>
-        </w:rPr>
-        <w:t xml:space="preserve">notes</w:t>
-      </w:r>
-      <w:r>
-        <w:br/>
-      </w:r>
-      <w:r>
-        <w:rPr>
-          <w:rStyle w:val="VerbatimChar"/>
-        </w:rPr>
-        <w:t xml:space="preserve">user_agent</w:t>
-      </w:r>
-    </w:p>
-    <w:p>
-      <w:pPr>
-        <w:pStyle w:val="FirstParagraph"/>
-      </w:pPr>
-      <w:r>
-        <w:t xml:space="preserve">重要字段说明：</w:t>
-      </w:r>
-    </w:p>
-    <w:p>
-      <w:pPr>
-        <w:pStyle w:val="SourceCode"/>
-      </w:pPr>
-      <w:r>
-        <w:rPr>
-          <w:rStyle w:val="VerbatimChar"/>
-        </w:rPr>
-        <w:t xml:space="preserve">submission_id       每次提交的唯一编号</w:t>
-      </w:r>
-      <w:r>
-        <w:br/>
-      </w:r>
-      <w:r>
-        <w:rPr>
-          <w:rStyle w:val="VerbatimChar"/>
-        </w:rPr>
-        <w:t xml:space="preserve">submitted_at        用户提交信息的时间</w:t>
-      </w:r>
-      <w:r>
-        <w:br/>
-      </w:r>
-      <w:r>
-        <w:rPr>
-          <w:rStyle w:val="VerbatimChar"/>
-        </w:rPr>
-        <w:t xml:space="preserve">folder_id           本次提交对应的 Drive 子文件夹 ID</w:t>
-      </w:r>
-      <w:r>
-        <w:br/>
-      </w:r>
-      <w:r>
-        <w:rPr>
-          <w:rStyle w:val="VerbatimChar"/>
-        </w:rPr>
-        <w:t xml:space="preserve">folder_url          用户上传视频的 Drive 文件夹链接</w:t>
-      </w:r>
-      <w:r>
-        <w:br/>
-      </w:r>
-      <w:r>
-        <w:rPr>
-          <w:rStyle w:val="VerbatimChar"/>
-        </w:rPr>
-        <w:t xml:space="preserve">status              当前状态</w:t>
-      </w:r>
-      <w:r>
-        <w:br/>
-      </w:r>
-      <w:r>
-        <w:rPr>
-          <w:rStyle w:val="VerbatimChar"/>
-        </w:rPr>
-        <w:t xml:space="preserve">completed_at        用户点击“我已完成上传”的时间</w:t>
-      </w:r>
-      <w:r>
-        <w:br/>
-      </w:r>
-      <w:r>
-        <w:rPr>
-          <w:rStyle w:val="VerbatimChar"/>
-        </w:rPr>
-        <w:t xml:space="preserve">file_count          该文件夹下扫描到的文件数量</w:t>
-      </w:r>
-      <w:r>
-        <w:br/>
-      </w:r>
-      <w:r>
-        <w:rPr>
-          <w:rStyle w:val="VerbatimChar"/>
-        </w:rPr>
-        <w:t xml:space="preserve">upload_file_names   上传文件名列表</w:t>
-      </w:r>
-      <w:r>
-        <w:br/>
-      </w:r>
-      <w:r>
-        <w:rPr>
-          <w:rStyle w:val="VerbatimChar"/>
-        </w:rPr>
-        <w:t xml:space="preserve">annotated_at        文件夹/文件标注时间</w:t>
-      </w:r>
-    </w:p>
-    <w:p>
-      <w:pPr>
-        <w:pStyle w:val="FirstParagraph"/>
-      </w:pPr>
-      <w:r>
-        <w:t xml:space="preserve">当前状态值：</w:t>
-      </w:r>
-    </w:p>
-    <w:p>
-      <w:pPr>
-        <w:pStyle w:val="SourceCode"/>
-      </w:pPr>
-      <w:r>
-        <w:rPr>
-          <w:rStyle w:val="VerbatimChar"/>
-        </w:rPr>
-        <w:t xml:space="preserve">pending_upload      已提交信息，等待用户上传</w:t>
-      </w:r>
-      <w:r>
-        <w:br/>
-      </w:r>
-      <w:r>
-        <w:rPr>
-          <w:rStyle w:val="VerbatimChar"/>
-        </w:rPr>
-        <w:t xml:space="preserve">user_confirmed      用户已点击“我已完成上传”</w:t>
-      </w:r>
-    </w:p>
-    <w:bookmarkEnd w:id="35"/>
-    <w:bookmarkStart w:id="38" w:name="七google-drive-文件夹和文件标注逻辑"/>
-    <w:p>
-      <w:pPr>
-        <w:pStyle w:val="Heading2"/>
-      </w:pPr>
-      <w:r>
-        <w:t xml:space="preserve">七、Google Drive 文件夹和文件标注逻辑</w:t>
-      </w:r>
-    </w:p>
-    <w:p>
-      <w:pPr>
-        <w:pStyle w:val="FirstParagraph"/>
-      </w:pPr>
-      <w:r>
-        <w:t xml:space="preserve">Apps Script 会自动给每次提交创建一个 Drive 子文件夹，名称类似：</w:t>
-      </w:r>
-    </w:p>
-    <w:p>
-      <w:pPr>
-        <w:pStyle w:val="SourceCode"/>
-      </w:pPr>
-      <w:r>
-        <w:rPr>
-          <w:rStyle w:val="VerbatimChar"/>
-        </w:rPr>
-        <w:t xml:space="preserve">VID-20260626-213000-ABCDEF12_张三_北京师范大学</w:t>
-      </w:r>
-    </w:p>
-    <w:bookmarkStart w:id="36" w:name="创建提交记录时"/>
-    <w:p>
-      <w:pPr>
-        <w:pStyle w:val="Heading3"/>
-      </w:pPr>
-      <w:r>
-        <w:t xml:space="preserve">1. 创建提交记录时</w:t>
-      </w:r>
-    </w:p>
-    <w:p>
-      <w:pPr>
-        <w:pStyle w:val="FirstParagraph"/>
-      </w:pPr>
-      <w:r>
-        <w:t xml:space="preserve">脚本会给 Drive 子文件夹写入描述信息，包括：</w:t>
-      </w:r>
-    </w:p>
-    <w:p>
-      <w:pPr>
-        <w:pStyle w:val="SourceCode"/>
-      </w:pPr>
-      <w:r>
-        <w:rPr>
-          <w:rStyle w:val="VerbatimChar"/>
-        </w:rPr>
-        <w:t xml:space="preserve">Submission ID</w:t>
-      </w:r>
-      <w:r>
-        <w:br/>
-      </w:r>
-      <w:r>
-        <w:rPr>
-          <w:rStyle w:val="VerbatimChar"/>
-        </w:rPr>
-        <w:t xml:space="preserve">Name</w:t>
-      </w:r>
-      <w:r>
-        <w:br/>
-      </w:r>
-      <w:r>
-        <w:rPr>
-          <w:rStyle w:val="VerbatimChar"/>
-        </w:rPr>
-        <w:t xml:space="preserve">Organization</w:t>
-      </w:r>
-      <w:r>
-        <w:br/>
-      </w:r>
-      <w:r>
-        <w:rPr>
-          <w:rStyle w:val="VerbatimChar"/>
-        </w:rPr>
-        <w:t xml:space="preserve">Email</w:t>
-      </w:r>
-      <w:r>
-        <w:br/>
-      </w:r>
-      <w:r>
-        <w:rPr>
-          <w:rStyle w:val="VerbatimChar"/>
-        </w:rPr>
-        <w:t xml:space="preserve">Countries</w:t>
-      </w:r>
-      <w:r>
-        <w:br/>
-      </w:r>
-      <w:r>
-        <w:rPr>
-          <w:rStyle w:val="VerbatimChar"/>
-        </w:rPr>
-        <w:t xml:space="preserve">Submitted at</w:t>
-      </w:r>
-      <w:r>
-        <w:br/>
-      </w:r>
-      <w:r>
-        <w:rPr>
-          <w:rStyle w:val="VerbatimChar"/>
-        </w:rPr>
-        <w:t xml:space="preserve">Folder URL</w:t>
-      </w:r>
-      <w:r>
-        <w:br/>
-      </w:r>
-      <w:r>
-        <w:rPr>
-          <w:rStyle w:val="VerbatimChar"/>
-        </w:rPr>
-        <w:t xml:space="preserve">Other notes</w:t>
-      </w:r>
-    </w:p>
-    <w:bookmarkEnd w:id="36"/>
-    <w:bookmarkStart w:id="37" w:name="用户点击我已完成上传时"/>
-    <w:p>
-      <w:pPr>
-        <w:pStyle w:val="Heading3"/>
-      </w:pPr>
-      <w:r>
-        <w:t xml:space="preserve">2. 用户点击</w:t>
-      </w:r>
-      <w:r>
-        <w:t xml:space="preserve">“</w:t>
-      </w:r>
-      <w:r>
-        <w:t xml:space="preserve">我已完成上传</w:t>
-      </w:r>
-      <w:r>
-        <w:t xml:space="preserve">”</w:t>
-      </w:r>
-      <w:r>
-        <w:t xml:space="preserve">时</w:t>
-      </w:r>
-    </w:p>
-    <w:p>
-      <w:pPr>
-        <w:pStyle w:val="FirstParagraph"/>
-      </w:pPr>
-      <w:r>
-        <w:t xml:space="preserve">脚本会：</w:t>
-      </w:r>
-    </w:p>
-    <w:p>
-      <w:pPr>
-        <w:pStyle w:val="SourceCode"/>
-      </w:pPr>
-      <w:r>
-        <w:rPr>
-          <w:rStyle w:val="VerbatimChar"/>
-        </w:rPr>
-        <w:t xml:space="preserve">1. 根据 submission_id 找到 Sheet 中对应行。</w:t>
-      </w:r>
-      <w:r>
-        <w:br/>
-      </w:r>
-      <w:r>
-        <w:rPr>
-          <w:rStyle w:val="VerbatimChar"/>
-        </w:rPr>
-        <w:t xml:space="preserve">2. 找到该行对应的 Drive 子文件夹。</w:t>
-      </w:r>
-      <w:r>
-        <w:br/>
-      </w:r>
-      <w:r>
-        <w:rPr>
-          <w:rStyle w:val="VerbatimChar"/>
-        </w:rPr>
-        <w:t xml:space="preserve">3. 扫描该文件夹中的文件。</w:t>
-      </w:r>
-      <w:r>
-        <w:br/>
-      </w:r>
-      <w:r>
-        <w:rPr>
-          <w:rStyle w:val="VerbatimChar"/>
-        </w:rPr>
-        <w:t xml:space="preserve">4. 给每个文件写入描述信息。</w:t>
-      </w:r>
-      <w:r>
-        <w:br/>
-      </w:r>
-      <w:r>
-        <w:rPr>
-          <w:rStyle w:val="VerbatimChar"/>
-        </w:rPr>
-        <w:t xml:space="preserve">5. 统计文件数量并写回 file_count。</w:t>
-      </w:r>
-      <w:r>
-        <w:br/>
-      </w:r>
-      <w:r>
-        <w:rPr>
-          <w:rStyle w:val="VerbatimChar"/>
-        </w:rPr>
-        <w:t xml:space="preserve">6. 把文件名列表写回 upload_file_names。</w:t>
-      </w:r>
-      <w:r>
-        <w:br/>
-      </w:r>
-      <w:r>
-        <w:rPr>
-          <w:rStyle w:val="VerbatimChar"/>
-        </w:rPr>
-        <w:t xml:space="preserve">7. 把标注时间写回 annotated_at。</w:t>
-      </w:r>
-      <w:r>
-        <w:br/>
-      </w:r>
-      <w:r>
-        <w:rPr>
-          <w:rStyle w:val="VerbatimChar"/>
-        </w:rPr>
-        <w:t xml:space="preserve">8. 把状态更新为 user_confirmed。</w:t>
-      </w:r>
-    </w:p>
-    <w:p>
-      <w:pPr>
-        <w:pStyle w:val="FirstParagraph"/>
-      </w:pPr>
-      <w:r>
-        <w:t xml:space="preserve">默认会自动重命名上传文件，给文件名前缀加上提交编号和序号：</w:t>
-      </w:r>
-    </w:p>
-    <w:p>
-      <w:pPr>
-        <w:pStyle w:val="SourceCode"/>
-      </w:pPr>
-      <w:r>
-        <w:rPr>
-          <w:rStyle w:val="VerbatimChar"/>
-        </w:rPr>
-        <w:t xml:space="preserve">VID-20260626-213000-ABCDEF12_01_original-video.mp4</w:t>
-      </w:r>
-    </w:p>
-    <w:p>
-      <w:pPr>
-        <w:pStyle w:val="FirstParagraph"/>
-      </w:pPr>
-      <w:r>
-        <w:t xml:space="preserve">如果不希望自动重命名，可以在</w:t>
-      </w:r>
-      <w:r>
-        <w:t xml:space="preserve"> </w:t>
-      </w:r>
-      <w:r>
-        <w:rPr>
-          <w:rStyle w:val="VerbatimChar"/>
-        </w:rPr>
-        <w:t xml:space="preserve">apps-script/Code.gs</w:t>
-      </w:r>
-      <w:r>
-        <w:t xml:space="preserve"> </w:t>
-      </w:r>
-      <w:r>
-        <w:t xml:space="preserve">顶部修改：</w:t>
-      </w:r>
-    </w:p>
-    <w:p>
-      <w:pPr>
-        <w:pStyle w:val="SourceCode"/>
-      </w:pPr>
-      <w:r>
-        <w:rPr>
-          <w:rStyle w:val="KeywordTok"/>
-        </w:rPr>
-        <w:t xml:space="preserve">const</w:t>
-      </w:r>
-      <w:r>
-        <w:rPr>
-          <w:rStyle w:val="NormalTok"/>
-        </w:rPr>
-        <w:t xml:space="preserve"> RENAME_UPLOADED_FILES </w:t>
-      </w:r>
-      <w:r>
-        <w:rPr>
-          <w:rStyle w:val="OperatorTok"/>
-        </w:rPr>
-        <w:t xml:space="preserve">=</w:t>
-      </w:r>
-      <w:r>
-        <w:rPr>
-          <w:rStyle w:val="NormalTok"/>
-        </w:rPr>
-        <w:t xml:space="preserve"> </w:t>
-      </w:r>
-      <w:r>
-        <w:rPr>
-          <w:rStyle w:val="KeywordTok"/>
-        </w:rPr>
-        <w:t xml:space="preserve">false</w:t>
-      </w:r>
-      <w:r>
-        <w:rPr>
-          <w:rStyle w:val="OperatorTok"/>
-        </w:rPr>
-        <w:t xml:space="preserve">;</w:t>
       </w:r>
     </w:p>
     <w:bookmarkEnd w:id="37"/>
     <w:bookmarkEnd w:id="38"/>
-    <w:bookmarkStart w:id="40" w:name="八apps-script-关键配置"/>
+    <w:bookmarkStart w:id="39" w:name="六google-sheet-表结构"/>
     <w:p>
       <w:pPr>
         <w:pStyle w:val="Heading2"/>
       </w:pPr>
       <w:r>
+        <w:t xml:space="preserve">六、Google Sheet 表结构</w:t>
+      </w:r>
+    </w:p>
+    <w:p>
+      <w:pPr>
+        <w:pStyle w:val="FirstParagraph"/>
+      </w:pPr>
+      <w:r>
+        <w:rPr>
+          <w:rStyle w:val="VerbatimChar"/>
+        </w:rPr>
+        <w:t xml:space="preserve">Submissions</w:t>
+      </w:r>
+      <w:r>
+        <w:t xml:space="preserve"> </w:t>
+      </w:r>
+      <w:r>
+        <w:t xml:space="preserve">工作表当前字段：</w:t>
+      </w:r>
+    </w:p>
+    <w:p>
+      <w:pPr>
+        <w:pStyle w:val="SourceCode"/>
+      </w:pPr>
+      <w:r>
+        <w:rPr>
+          <w:rStyle w:val="VerbatimChar"/>
+        </w:rPr>
+        <w:t xml:space="preserve">submission_id</w:t>
+      </w:r>
+      <w:r>
+        <w:br/>
+      </w:r>
+      <w:r>
+        <w:rPr>
+          <w:rStyle w:val="VerbatimChar"/>
+        </w:rPr>
+        <w:t xml:space="preserve">submitted_at</w:t>
+      </w:r>
+      <w:r>
+        <w:br/>
+      </w:r>
+      <w:r>
+        <w:rPr>
+          <w:rStyle w:val="VerbatimChar"/>
+        </w:rPr>
+        <w:t xml:space="preserve">name</w:t>
+      </w:r>
+      <w:r>
+        <w:br/>
+      </w:r>
+      <w:r>
+        <w:rPr>
+          <w:rStyle w:val="VerbatimChar"/>
+        </w:rPr>
+        <w:t xml:space="preserve">organization</w:t>
+      </w:r>
+      <w:r>
+        <w:br/>
+      </w:r>
+      <w:r>
+        <w:rPr>
+          <w:rStyle w:val="VerbatimChar"/>
+        </w:rPr>
+        <w:t xml:space="preserve">email</w:t>
+      </w:r>
+      <w:r>
+        <w:br/>
+      </w:r>
+      <w:r>
+        <w:rPr>
+          <w:rStyle w:val="VerbatimChar"/>
+        </w:rPr>
+        <w:t xml:space="preserve">countries</w:t>
+      </w:r>
+      <w:r>
+        <w:br/>
+      </w:r>
+      <w:r>
+        <w:rPr>
+          <w:rStyle w:val="VerbatimChar"/>
+        </w:rPr>
+        <w:t xml:space="preserve">others</w:t>
+      </w:r>
+      <w:r>
+        <w:br/>
+      </w:r>
+      <w:r>
+        <w:rPr>
+          <w:rStyle w:val="VerbatimChar"/>
+        </w:rPr>
+        <w:t xml:space="preserve">folder_id</w:t>
+      </w:r>
+      <w:r>
+        <w:br/>
+      </w:r>
+      <w:r>
+        <w:rPr>
+          <w:rStyle w:val="VerbatimChar"/>
+        </w:rPr>
+        <w:t xml:space="preserve">folder_url</w:t>
+      </w:r>
+      <w:r>
+        <w:br/>
+      </w:r>
+      <w:r>
+        <w:rPr>
+          <w:rStyle w:val="VerbatimChar"/>
+        </w:rPr>
+        <w:t xml:space="preserve">status</w:t>
+      </w:r>
+      <w:r>
+        <w:br/>
+      </w:r>
+      <w:r>
+        <w:rPr>
+          <w:rStyle w:val="VerbatimChar"/>
+        </w:rPr>
+        <w:t xml:space="preserve">completed_at</w:t>
+      </w:r>
+      <w:r>
+        <w:br/>
+      </w:r>
+      <w:r>
+        <w:rPr>
+          <w:rStyle w:val="VerbatimChar"/>
+        </w:rPr>
+        <w:t xml:space="preserve">file_count</w:t>
+      </w:r>
+      <w:r>
+        <w:br/>
+      </w:r>
+      <w:r>
+        <w:rPr>
+          <w:rStyle w:val="VerbatimChar"/>
+        </w:rPr>
+        <w:t xml:space="preserve">upload_file_names</w:t>
+      </w:r>
+      <w:r>
+        <w:br/>
+      </w:r>
+      <w:r>
+        <w:rPr>
+          <w:rStyle w:val="VerbatimChar"/>
+        </w:rPr>
+        <w:t xml:space="preserve">annotated_at</w:t>
+      </w:r>
+      <w:r>
+        <w:br/>
+      </w:r>
+      <w:r>
+        <w:rPr>
+          <w:rStyle w:val="VerbatimChar"/>
+        </w:rPr>
+        <w:t xml:space="preserve">notes</w:t>
+      </w:r>
+      <w:r>
+        <w:br/>
+      </w:r>
+      <w:r>
+        <w:rPr>
+          <w:rStyle w:val="VerbatimChar"/>
+        </w:rPr>
+        <w:t xml:space="preserve">user_agent</w:t>
+      </w:r>
+    </w:p>
+    <w:p>
+      <w:pPr>
+        <w:pStyle w:val="FirstParagraph"/>
+      </w:pPr>
+      <w:r>
+        <w:t xml:space="preserve">重要字段说明：</w:t>
+      </w:r>
+    </w:p>
+    <w:p>
+      <w:pPr>
+        <w:pStyle w:val="SourceCode"/>
+      </w:pPr>
+      <w:r>
+        <w:rPr>
+          <w:rStyle w:val="VerbatimChar"/>
+        </w:rPr>
+        <w:t xml:space="preserve">submission_id       每次提交的唯一编号</w:t>
+      </w:r>
+      <w:r>
+        <w:br/>
+      </w:r>
+      <w:r>
+        <w:rPr>
+          <w:rStyle w:val="VerbatimChar"/>
+        </w:rPr>
+        <w:t xml:space="preserve">submitted_at        用户提交信息的时间</w:t>
+      </w:r>
+      <w:r>
+        <w:br/>
+      </w:r>
+      <w:r>
+        <w:rPr>
+          <w:rStyle w:val="VerbatimChar"/>
+        </w:rPr>
+        <w:t xml:space="preserve">folder_id           本次提交对应的 Drive 子文件夹 ID</w:t>
+      </w:r>
+      <w:r>
+        <w:br/>
+      </w:r>
+      <w:r>
+        <w:rPr>
+          <w:rStyle w:val="VerbatimChar"/>
+        </w:rPr>
+        <w:t xml:space="preserve">folder_url          用户上传视频的 Drive 文件夹链接</w:t>
+      </w:r>
+      <w:r>
+        <w:br/>
+      </w:r>
+      <w:r>
+        <w:rPr>
+          <w:rStyle w:val="VerbatimChar"/>
+        </w:rPr>
+        <w:t xml:space="preserve">status              当前状态</w:t>
+      </w:r>
+      <w:r>
+        <w:br/>
+      </w:r>
+      <w:r>
+        <w:rPr>
+          <w:rStyle w:val="VerbatimChar"/>
+        </w:rPr>
+        <w:t xml:space="preserve">completed_at        用户点击“我已完成上传”的时间</w:t>
+      </w:r>
+      <w:r>
+        <w:br/>
+      </w:r>
+      <w:r>
+        <w:rPr>
+          <w:rStyle w:val="VerbatimChar"/>
+        </w:rPr>
+        <w:t xml:space="preserve">file_count          该文件夹下扫描到的文件数量</w:t>
+      </w:r>
+      <w:r>
+        <w:br/>
+      </w:r>
+      <w:r>
+        <w:rPr>
+          <w:rStyle w:val="VerbatimChar"/>
+        </w:rPr>
+        <w:t xml:space="preserve">upload_file_names   上传文件名列表</w:t>
+      </w:r>
+      <w:r>
+        <w:br/>
+      </w:r>
+      <w:r>
+        <w:rPr>
+          <w:rStyle w:val="VerbatimChar"/>
+        </w:rPr>
+        <w:t xml:space="preserve">annotated_at        文件夹/文件标注时间</w:t>
+      </w:r>
+      <w:r>
+        <w:br/>
+      </w:r>
+      <w:r>
+        <w:rPr>
+          <w:rStyle w:val="VerbatimChar"/>
+        </w:rPr>
+        <w:t xml:space="preserve">notes               共享到邮箱、邮件通知等辅助执行结果</w:t>
+      </w:r>
+    </w:p>
+    <w:p>
+      <w:pPr>
+        <w:pStyle w:val="FirstParagraph"/>
+      </w:pPr>
+      <w:r>
+        <w:rPr>
+          <w:rStyle w:val="VerbatimChar"/>
+        </w:rPr>
+        <w:t xml:space="preserve">notes</w:t>
+      </w:r>
+      <w:r>
+        <w:t xml:space="preserve"> </w:t>
+      </w:r>
+      <w:r>
+        <w:t xml:space="preserve">字段当前会记录 Apps Script 尝试共享和发信的结果，例如：</w:t>
+      </w:r>
+    </w:p>
+    <w:p>
+      <w:pPr>
+        <w:pStyle w:val="SourceCode"/>
+      </w:pPr>
+      <w:r>
+        <w:rPr>
+          <w:rStyle w:val="VerbatimChar"/>
+        </w:rPr>
+        <w:t xml:space="preserve">direct_email_share_added: user@gmail.com</w:t>
+      </w:r>
+      <w:r>
+        <w:br/>
+      </w:r>
+      <w:r>
+        <w:rPr>
+          <w:rStyle w:val="VerbatimChar"/>
+        </w:rPr>
+        <w:t xml:space="preserve">email_notification_sent: user@gmail.com</w:t>
+      </w:r>
+      <w:r>
+        <w:br/>
+      </w:r>
+      <w:r>
+        <w:rPr>
+          <w:rStyle w:val="VerbatimChar"/>
+        </w:rPr>
+        <w:t xml:space="preserve">direct_email_share_failed: user@gmail.com: ...</w:t>
+      </w:r>
+      <w:r>
+        <w:br/>
+      </w:r>
+      <w:r>
+        <w:rPr>
+          <w:rStyle w:val="VerbatimChar"/>
+        </w:rPr>
+        <w:t xml:space="preserve">email_notification_failed: user@gmail.com: ...</w:t>
+      </w:r>
+    </w:p>
+    <w:p>
+      <w:pPr>
+        <w:pStyle w:val="FirstParagraph"/>
+      </w:pPr>
+      <w:r>
+        <w:t xml:space="preserve">Mobile 端前端会根据 Apps Script 返回的</w:t>
+      </w:r>
+      <w:r>
+        <w:t xml:space="preserve"> </w:t>
+      </w:r>
+      <w:r>
+        <w:rPr>
+          <w:rStyle w:val="VerbatimChar"/>
+        </w:rPr>
+        <w:t xml:space="preserve">sharingNote</w:t>
+      </w:r>
+      <w:r>
+        <w:t xml:space="preserve"> </w:t>
+      </w:r>
+      <w:r>
+        <w:t xml:space="preserve">判断是否显示</w:t>
+      </w:r>
+      <w:r>
+        <w:t xml:space="preserve">“</w:t>
+      </w:r>
+      <w:r>
+        <w:t xml:space="preserve">已共享到你的 Gmail</w:t>
+      </w:r>
+      <w:r>
+        <w:t xml:space="preserve">”</w:t>
+      </w:r>
+      <w:r>
+        <w:t xml:space="preserve">的成功提示。</w:t>
+      </w:r>
+    </w:p>
+    <w:p>
+      <w:pPr>
+        <w:pStyle w:val="BodyText"/>
+      </w:pPr>
+      <w:r>
+        <w:t xml:space="preserve">当前状态值：</w:t>
+      </w:r>
+    </w:p>
+    <w:p>
+      <w:pPr>
+        <w:pStyle w:val="SourceCode"/>
+      </w:pPr>
+      <w:r>
+        <w:rPr>
+          <w:rStyle w:val="VerbatimChar"/>
+        </w:rPr>
+        <w:t xml:space="preserve">pending_upload      已提交信息，等待用户上传</w:t>
+      </w:r>
+      <w:r>
+        <w:br/>
+      </w:r>
+      <w:r>
+        <w:rPr>
+          <w:rStyle w:val="VerbatimChar"/>
+        </w:rPr>
+        <w:t xml:space="preserve">user_confirmed      用户已点击“我已完成上传”</w:t>
+      </w:r>
+    </w:p>
+    <w:bookmarkEnd w:id="39"/>
+    <w:bookmarkStart w:id="42" w:name="七google-drive-文件夹和文件标注逻辑"/>
+    <w:p>
+      <w:pPr>
+        <w:pStyle w:val="Heading2"/>
+      </w:pPr>
+      <w:r>
+        <w:t xml:space="preserve">七、Google Drive 文件夹和文件标注逻辑</w:t>
+      </w:r>
+    </w:p>
+    <w:p>
+      <w:pPr>
+        <w:pStyle w:val="FirstParagraph"/>
+      </w:pPr>
+      <w:r>
+        <w:t xml:space="preserve">Apps Script 会自动给每次提交创建一个 Drive 子文件夹，名称类似：</w:t>
+      </w:r>
+    </w:p>
+    <w:p>
+      <w:pPr>
+        <w:pStyle w:val="SourceCode"/>
+      </w:pPr>
+      <w:r>
+        <w:rPr>
+          <w:rStyle w:val="VerbatimChar"/>
+        </w:rPr>
+        <w:t xml:space="preserve">VID-20260626-213000-ABCDEF12_张三_北京师范大学</w:t>
+      </w:r>
+    </w:p>
+    <w:bookmarkStart w:id="40" w:name="创建提交记录时"/>
+    <w:p>
+      <w:pPr>
+        <w:pStyle w:val="Heading3"/>
+      </w:pPr>
+      <w:r>
+        <w:t xml:space="preserve">1. 创建提交记录时</w:t>
+      </w:r>
+    </w:p>
+    <w:p>
+      <w:pPr>
+        <w:pStyle w:val="FirstParagraph"/>
+      </w:pPr>
+      <w:r>
+        <w:t xml:space="preserve">脚本会给 Drive 子文件夹写入描述信息，包括：</w:t>
+      </w:r>
+    </w:p>
+    <w:p>
+      <w:pPr>
+        <w:pStyle w:val="SourceCode"/>
+      </w:pPr>
+      <w:r>
+        <w:rPr>
+          <w:rStyle w:val="VerbatimChar"/>
+        </w:rPr>
+        <w:t xml:space="preserve">Submission ID</w:t>
+      </w:r>
+      <w:r>
+        <w:br/>
+      </w:r>
+      <w:r>
+        <w:rPr>
+          <w:rStyle w:val="VerbatimChar"/>
+        </w:rPr>
+        <w:t xml:space="preserve">Name</w:t>
+      </w:r>
+      <w:r>
+        <w:br/>
+      </w:r>
+      <w:r>
+        <w:rPr>
+          <w:rStyle w:val="VerbatimChar"/>
+        </w:rPr>
+        <w:t xml:space="preserve">Organization</w:t>
+      </w:r>
+      <w:r>
+        <w:br/>
+      </w:r>
+      <w:r>
+        <w:rPr>
+          <w:rStyle w:val="VerbatimChar"/>
+        </w:rPr>
+        <w:t xml:space="preserve">Email</w:t>
+      </w:r>
+      <w:r>
+        <w:br/>
+      </w:r>
+      <w:r>
+        <w:rPr>
+          <w:rStyle w:val="VerbatimChar"/>
+        </w:rPr>
+        <w:t xml:space="preserve">Countries</w:t>
+      </w:r>
+      <w:r>
+        <w:br/>
+      </w:r>
+      <w:r>
+        <w:rPr>
+          <w:rStyle w:val="VerbatimChar"/>
+        </w:rPr>
+        <w:t xml:space="preserve">Submitted at</w:t>
+      </w:r>
+      <w:r>
+        <w:br/>
+      </w:r>
+      <w:r>
+        <w:rPr>
+          <w:rStyle w:val="VerbatimChar"/>
+        </w:rPr>
+        <w:t xml:space="preserve">Folder URL</w:t>
+      </w:r>
+      <w:r>
+        <w:br/>
+      </w:r>
+      <w:r>
+        <w:rPr>
+          <w:rStyle w:val="VerbatimChar"/>
+        </w:rPr>
+        <w:t xml:space="preserve">Other notes</w:t>
+      </w:r>
+    </w:p>
+    <w:p>
+      <w:pPr>
+        <w:pStyle w:val="FirstParagraph"/>
+      </w:pPr>
+      <w:r>
+        <w:t xml:space="preserve">同时脚本会执行以下权限设置：</w:t>
+      </w:r>
+    </w:p>
+    <w:p>
+      <w:pPr>
+        <w:pStyle w:val="SourceCode"/>
+      </w:pPr>
+      <w:r>
+        <w:rPr>
+          <w:rStyle w:val="VerbatimChar"/>
+        </w:rPr>
+        <w:t xml:space="preserve">1. folder.setSharing(DriveApp.Access.ANYONE_WITH_LINK, DriveApp.Permission.EDIT)</w:t>
+      </w:r>
+      <w:r>
+        <w:br/>
+      </w:r>
+      <w:r>
+        <w:rPr>
+          <w:rStyle w:val="VerbatimChar"/>
+        </w:rPr>
+        <w:t xml:space="preserve">2. folder.addEditor(request.email)</w:t>
+      </w:r>
+    </w:p>
+    <w:p>
+      <w:pPr>
+        <w:pStyle w:val="FirstParagraph"/>
+      </w:pPr>
+      <w:r>
+        <w:t xml:space="preserve">第一步用于保留 PC 端通过链接上传的能力。第二步用于把子文件夹直接共享给用户填写的邮箱，尤其方便 Mobile 用户在 Google Drive App 的</w:t>
+      </w:r>
+      <w:r>
+        <w:t xml:space="preserve">“</w:t>
+      </w:r>
+      <w:r>
+        <w:t xml:space="preserve">与我共享</w:t>
+      </w:r>
+      <w:r>
+        <w:t xml:space="preserve">”</w:t>
+      </w:r>
+      <w:r>
+        <w:t xml:space="preserve">中找到该文件夹。</w:t>
+      </w:r>
+    </w:p>
+    <w:p>
+      <w:pPr>
+        <w:pStyle w:val="BodyText"/>
+      </w:pPr>
+      <w:r>
+        <w:t xml:space="preserve">脚本还会尝试向用户填写的邮箱发送一封通知邮件，邮件中包含：</w:t>
+      </w:r>
+    </w:p>
+    <w:p>
+      <w:pPr>
+        <w:pStyle w:val="SourceCode"/>
+      </w:pPr>
+      <w:r>
+        <w:rPr>
+          <w:rStyle w:val="VerbatimChar"/>
+        </w:rPr>
+        <w:t xml:space="preserve">Submission ID</w:t>
+      </w:r>
+      <w:r>
+        <w:br/>
+      </w:r>
+      <w:r>
+        <w:rPr>
+          <w:rStyle w:val="VerbatimChar"/>
+        </w:rPr>
+        <w:t xml:space="preserve">Upload folder URL</w:t>
+      </w:r>
+      <w:r>
+        <w:br/>
+      </w:r>
+      <w:r>
+        <w:rPr>
+          <w:rStyle w:val="VerbatimChar"/>
+        </w:rPr>
+        <w:t xml:space="preserve">Mobile upload guidance</w:t>
+      </w:r>
+    </w:p>
+    <w:p>
+      <w:pPr>
+        <w:pStyle w:val="FirstParagraph"/>
+      </w:pPr>
+      <w:r>
+        <w:t xml:space="preserve">注意：如果邮箱不是有效 Google/Gmail 账号、Workspace 管理员限制共享、或 MailApp 权限未授权，共享或邮件可能失败。失败不会阻止提交记录创建，但会写入</w:t>
+      </w:r>
+      <w:r>
+        <w:t xml:space="preserve"> </w:t>
+      </w:r>
+      <w:r>
+        <w:rPr>
+          <w:rStyle w:val="VerbatimChar"/>
+        </w:rPr>
+        <w:t xml:space="preserve">notes</w:t>
+      </w:r>
+      <w:r>
+        <w:t xml:space="preserve">。</w:t>
+      </w:r>
+    </w:p>
+    <w:bookmarkEnd w:id="40"/>
+    <w:bookmarkStart w:id="41" w:name="用户点击我已完成上传时"/>
+    <w:p>
+      <w:pPr>
+        <w:pStyle w:val="Heading3"/>
+      </w:pPr>
+      <w:r>
+        <w:t xml:space="preserve">2. 用户点击</w:t>
+      </w:r>
+      <w:r>
+        <w:t xml:space="preserve">“</w:t>
+      </w:r>
+      <w:r>
+        <w:t xml:space="preserve">我已完成上传</w:t>
+      </w:r>
+      <w:r>
+        <w:t xml:space="preserve">”</w:t>
+      </w:r>
+      <w:r>
+        <w:t xml:space="preserve">时</w:t>
+      </w:r>
+    </w:p>
+    <w:p>
+      <w:pPr>
+        <w:pStyle w:val="FirstParagraph"/>
+      </w:pPr>
+      <w:r>
+        <w:t xml:space="preserve">脚本会：</w:t>
+      </w:r>
+    </w:p>
+    <w:p>
+      <w:pPr>
+        <w:pStyle w:val="SourceCode"/>
+      </w:pPr>
+      <w:r>
+        <w:rPr>
+          <w:rStyle w:val="VerbatimChar"/>
+        </w:rPr>
+        <w:t xml:space="preserve">1. 根据 submission_id 找到 Sheet 中对应行。</w:t>
+      </w:r>
+      <w:r>
+        <w:br/>
+      </w:r>
+      <w:r>
+        <w:rPr>
+          <w:rStyle w:val="VerbatimChar"/>
+        </w:rPr>
+        <w:t xml:space="preserve">2. 找到该行对应的 Drive 子文件夹。</w:t>
+      </w:r>
+      <w:r>
+        <w:br/>
+      </w:r>
+      <w:r>
+        <w:rPr>
+          <w:rStyle w:val="VerbatimChar"/>
+        </w:rPr>
+        <w:t xml:space="preserve">3. 扫描该文件夹中的文件。</w:t>
+      </w:r>
+      <w:r>
+        <w:br/>
+      </w:r>
+      <w:r>
+        <w:rPr>
+          <w:rStyle w:val="VerbatimChar"/>
+        </w:rPr>
+        <w:t xml:space="preserve">4. 给每个文件写入描述信息。</w:t>
+      </w:r>
+      <w:r>
+        <w:br/>
+      </w:r>
+      <w:r>
+        <w:rPr>
+          <w:rStyle w:val="VerbatimChar"/>
+        </w:rPr>
+        <w:t xml:space="preserve">5. 统计文件数量并写回 file_count。</w:t>
+      </w:r>
+      <w:r>
+        <w:br/>
+      </w:r>
+      <w:r>
+        <w:rPr>
+          <w:rStyle w:val="VerbatimChar"/>
+        </w:rPr>
+        <w:t xml:space="preserve">6. 把文件名列表写回 upload_file_names。</w:t>
+      </w:r>
+      <w:r>
+        <w:br/>
+      </w:r>
+      <w:r>
+        <w:rPr>
+          <w:rStyle w:val="VerbatimChar"/>
+        </w:rPr>
+        <w:t xml:space="preserve">7. 把标注时间写回 annotated_at。</w:t>
+      </w:r>
+      <w:r>
+        <w:br/>
+      </w:r>
+      <w:r>
+        <w:rPr>
+          <w:rStyle w:val="VerbatimChar"/>
+        </w:rPr>
+        <w:t xml:space="preserve">8. 把状态更新为 user_confirmed。</w:t>
+      </w:r>
+    </w:p>
+    <w:p>
+      <w:pPr>
+        <w:pStyle w:val="FirstParagraph"/>
+      </w:pPr>
+      <w:r>
+        <w:t xml:space="preserve">默认会自动重命名上传文件，给文件名前缀加上提交编号和序号：</w:t>
+      </w:r>
+    </w:p>
+    <w:p>
+      <w:pPr>
+        <w:pStyle w:val="SourceCode"/>
+      </w:pPr>
+      <w:r>
+        <w:rPr>
+          <w:rStyle w:val="VerbatimChar"/>
+        </w:rPr>
+        <w:t xml:space="preserve">VID-20260626-213000-ABCDEF12_01_original-video.mp4</w:t>
+      </w:r>
+    </w:p>
+    <w:p>
+      <w:pPr>
+        <w:pStyle w:val="FirstParagraph"/>
+      </w:pPr>
+      <w:r>
+        <w:t xml:space="preserve">如果不希望自动重命名，可以在</w:t>
+      </w:r>
+      <w:r>
+        <w:t xml:space="preserve"> </w:t>
+      </w:r>
+      <w:r>
+        <w:rPr>
+          <w:rStyle w:val="VerbatimChar"/>
+        </w:rPr>
+        <w:t xml:space="preserve">apps-script/Code.gs</w:t>
+      </w:r>
+      <w:r>
+        <w:t xml:space="preserve"> </w:t>
+      </w:r>
+      <w:r>
+        <w:t xml:space="preserve">顶部修改：</w:t>
+      </w:r>
+    </w:p>
+    <w:p>
+      <w:pPr>
+        <w:pStyle w:val="SourceCode"/>
+      </w:pPr>
+      <w:r>
+        <w:rPr>
+          <w:rStyle w:val="KeywordTok"/>
+        </w:rPr>
+        <w:t xml:space="preserve">const</w:t>
+      </w:r>
+      <w:r>
+        <w:rPr>
+          <w:rStyle w:val="NormalTok"/>
+        </w:rPr>
+        <w:t xml:space="preserve"> RENAME_UPLOADED_FILES </w:t>
+      </w:r>
+      <w:r>
+        <w:rPr>
+          <w:rStyle w:val="OperatorTok"/>
+        </w:rPr>
+        <w:t xml:space="preserve">=</w:t>
+      </w:r>
+      <w:r>
+        <w:rPr>
+          <w:rStyle w:val="NormalTok"/>
+        </w:rPr>
+        <w:t xml:space="preserve"> </w:t>
+      </w:r>
+      <w:r>
+        <w:rPr>
+          <w:rStyle w:val="KeywordTok"/>
+        </w:rPr>
+        <w:t xml:space="preserve">false</w:t>
+      </w:r>
+      <w:r>
+        <w:rPr>
+          <w:rStyle w:val="OperatorTok"/>
+        </w:rPr>
+        <w:t xml:space="preserve">;</w:t>
+      </w:r>
+    </w:p>
+    <w:bookmarkEnd w:id="41"/>
+    <w:bookmarkEnd w:id="42"/>
+    <w:bookmarkStart w:id="45" w:name="八apps-script-关键配置"/>
+    <w:p>
+      <w:pPr>
+        <w:pStyle w:val="Heading2"/>
+      </w:pPr>
+      <w:r>
         <w:t xml:space="preserve">八、Apps Script 关键配置</w:t>
       </w:r>
     </w:p>
@@ -2008,12 +2884,236 @@
         <w:t xml:space="preserve">;</w:t>
       </w:r>
     </w:p>
-    <w:bookmarkStart w:id="39" w:name="重新部署-apps-script-的注意事项"/>
+    <w:bookmarkStart w:id="43" w:name="gmail-共享和邮件通知"/>
     <w:p>
       <w:pPr>
         <w:pStyle w:val="Heading3"/>
       </w:pPr>
       <w:r>
+        <w:t xml:space="preserve">Gmail 共享和邮件通知</w:t>
+      </w:r>
+    </w:p>
+    <w:p>
+      <w:pPr>
+        <w:pStyle w:val="FirstParagraph"/>
+      </w:pPr>
+      <w:r>
+        <w:t xml:space="preserve">当前</w:t>
+      </w:r>
+      <w:r>
+        <w:t xml:space="preserve"> </w:t>
+      </w:r>
+      <w:r>
+        <w:rPr>
+          <w:rStyle w:val="VerbatimChar"/>
+        </w:rPr>
+        <w:t xml:space="preserve">createSubmission_</w:t>
+      </w:r>
+      <w:r>
+        <w:t xml:space="preserve"> </w:t>
+      </w:r>
+      <w:r>
+        <w:t xml:space="preserve">创建文件夹后，会调用：</w:t>
+      </w:r>
+    </w:p>
+    <w:p>
+      <w:pPr>
+        <w:pStyle w:val="SourceCode"/>
+      </w:pPr>
+      <w:r>
+        <w:rPr>
+          <w:rStyle w:val="KeywordTok"/>
+        </w:rPr>
+        <w:t xml:space="preserve">const</w:t>
+      </w:r>
+      <w:r>
+        <w:rPr>
+          <w:rStyle w:val="NormalTok"/>
+        </w:rPr>
+        <w:t xml:space="preserve"> sharingNote </w:t>
+      </w:r>
+      <w:r>
+        <w:rPr>
+          <w:rStyle w:val="OperatorTok"/>
+        </w:rPr>
+        <w:t xml:space="preserve">=</w:t>
+      </w:r>
+      <w:r>
+        <w:rPr>
+          <w:rStyle w:val="NormalTok"/>
+        </w:rPr>
+        <w:t xml:space="preserve"> </w:t>
+      </w:r>
+      <w:r>
+        <w:rPr>
+          <w:rStyle w:val="FunctionTok"/>
+        </w:rPr>
+        <w:t xml:space="preserve">shareUploadFolderWithEmail_</w:t>
+      </w:r>
+      <w:r>
+        <w:rPr>
+          <w:rStyle w:val="NormalTok"/>
+        </w:rPr>
+        <w:t xml:space="preserve">(folder</w:t>
+      </w:r>
+      <w:r>
+        <w:rPr>
+          <w:rStyle w:val="OperatorTok"/>
+        </w:rPr>
+        <w:t xml:space="preserve">,</w:t>
+      </w:r>
+      <w:r>
+        <w:rPr>
+          <w:rStyle w:val="NormalTok"/>
+        </w:rPr>
+        <w:t xml:space="preserve"> request</w:t>
+      </w:r>
+      <w:r>
+        <w:rPr>
+          <w:rStyle w:val="OperatorTok"/>
+        </w:rPr>
+        <w:t xml:space="preserve">.</w:t>
+      </w:r>
+      <w:r>
+        <w:rPr>
+          <w:rStyle w:val="AttributeTok"/>
+        </w:rPr>
+        <w:t xml:space="preserve">email</w:t>
+      </w:r>
+      <w:r>
+        <w:rPr>
+          <w:rStyle w:val="OperatorTok"/>
+        </w:rPr>
+        <w:t xml:space="preserve">,</w:t>
+      </w:r>
+      <w:r>
+        <w:rPr>
+          <w:rStyle w:val="NormalTok"/>
+        </w:rPr>
+        <w:t xml:space="preserve"> folderUrl</w:t>
+      </w:r>
+      <w:r>
+        <w:rPr>
+          <w:rStyle w:val="OperatorTok"/>
+        </w:rPr>
+        <w:t xml:space="preserve">,</w:t>
+      </w:r>
+      <w:r>
+        <w:rPr>
+          <w:rStyle w:val="NormalTok"/>
+        </w:rPr>
+        <w:t xml:space="preserve"> submissionId)</w:t>
+      </w:r>
+      <w:r>
+        <w:rPr>
+          <w:rStyle w:val="OperatorTok"/>
+        </w:rPr>
+        <w:t xml:space="preserve">;</w:t>
+      </w:r>
+    </w:p>
+    <w:p>
+      <w:pPr>
+        <w:pStyle w:val="FirstParagraph"/>
+      </w:pPr>
+      <w:r>
+        <w:rPr>
+          <w:rStyle w:val="VerbatimChar"/>
+        </w:rPr>
+        <w:t xml:space="preserve">shareUploadFolderWithEmail_</w:t>
+      </w:r>
+      <w:r>
+        <w:t xml:space="preserve"> </w:t>
+      </w:r>
+      <w:r>
+        <w:t xml:space="preserve">会：</w:t>
+      </w:r>
+    </w:p>
+    <w:p>
+      <w:pPr>
+        <w:pStyle w:val="SourceCode"/>
+      </w:pPr>
+      <w:r>
+        <w:rPr>
+          <w:rStyle w:val="VerbatimChar"/>
+        </w:rPr>
+        <w:t xml:space="preserve">1. 读取表单 email。</w:t>
+      </w:r>
+      <w:r>
+        <w:br/>
+      </w:r>
+      <w:r>
+        <w:rPr>
+          <w:rStyle w:val="VerbatimChar"/>
+        </w:rPr>
+        <w:t xml:space="preserve">2. 调用 folder.addEditor(email)，把上传子文件夹直接共享给该邮箱。</w:t>
+      </w:r>
+      <w:r>
+        <w:br/>
+      </w:r>
+      <w:r>
+        <w:rPr>
+          <w:rStyle w:val="VerbatimChar"/>
+        </w:rPr>
+        <w:t xml:space="preserve">3. 调用 MailApp.sendEmail(email, ...)，发送上传文件夹链接。</w:t>
+      </w:r>
+      <w:r>
+        <w:br/>
+      </w:r>
+      <w:r>
+        <w:rPr>
+          <w:rStyle w:val="VerbatimChar"/>
+        </w:rPr>
+        <w:t xml:space="preserve">4. 把共享和发信结果合并为 sharingNote。</w:t>
+      </w:r>
+      <w:r>
+        <w:br/>
+      </w:r>
+      <w:r>
+        <w:rPr>
+          <w:rStyle w:val="VerbatimChar"/>
+        </w:rPr>
+        <w:t xml:space="preserve">5. 将 sharingNote 写入 Sheet 的 notes 字段。</w:t>
+      </w:r>
+      <w:r>
+        <w:br/>
+      </w:r>
+      <w:r>
+        <w:rPr>
+          <w:rStyle w:val="VerbatimChar"/>
+        </w:rPr>
+        <w:t xml:space="preserve">6. 将 sharingNote 返回给前端。</w:t>
+      </w:r>
+    </w:p>
+    <w:p>
+      <w:pPr>
+        <w:pStyle w:val="FirstParagraph"/>
+      </w:pPr>
+      <w:r>
+        <w:t xml:space="preserve">如果修改或新增了</w:t>
+      </w:r>
+      <w:r>
+        <w:t xml:space="preserve"> </w:t>
+      </w:r>
+      <w:r>
+        <w:rPr>
+          <w:rStyle w:val="VerbatimChar"/>
+        </w:rPr>
+        <w:t xml:space="preserve">MailApp.sendEmail</w:t>
+      </w:r>
+      <w:r>
+        <w:t xml:space="preserve"> </w:t>
+      </w:r>
+      <w:r>
+        <w:t xml:space="preserve">相关逻辑，Apps Script 可能要求重新授权邮件发送权限。</w:t>
+      </w:r>
+    </w:p>
+    <w:bookmarkEnd w:id="43"/>
+    <w:bookmarkStart w:id="44" w:name="重新部署-apps-script-的注意事项"/>
+    <w:p>
+      <w:pPr>
+        <w:pStyle w:val="Heading3"/>
+      </w:pPr>
+      <w:r>
         <w:t xml:space="preserve">重新部署 Apps Script 的注意事项</w:t>
       </w:r>
     </w:p>
@@ -2089,9 +3189,9 @@
         <w:t xml:space="preserve">地址可能仍然运行旧版本代码。</w:t>
       </w:r>
     </w:p>
-    <w:bookmarkEnd w:id="39"/>
-    <w:bookmarkEnd w:id="40"/>
-    <w:bookmarkStart w:id="41" w:name="九为什么使用隐藏-iframe-提交"/>
+    <w:bookmarkEnd w:id="44"/>
+    <w:bookmarkEnd w:id="45"/>
+    <w:bookmarkStart w:id="46" w:name="九为什么使用隐藏-iframe-提交"/>
     <w:p>
       <w:pPr>
         <w:pStyle w:val="Heading2"/>
@@ -2244,8 +3344,8 @@
         <w:t xml:space="preserve">前端现在把字段作为普通表单字段提交，而不是只提交 JSON 字符串，避免不同环境下 JSON 解码不一致导致无法写入 Sheet。</w:t>
       </w:r>
     </w:p>
-    <w:bookmarkEnd w:id="41"/>
-    <w:bookmarkStart w:id="42" w:name="十github-pages-自动部署"/>
+    <w:bookmarkEnd w:id="46"/>
+    <w:bookmarkStart w:id="47" w:name="十github-pages-自动部署"/>
     <w:p>
       <w:pPr>
         <w:pStyle w:val="Heading2"/>
@@ -2384,8 +3484,8 @@
         <w:t xml:space="preserve">分支，部署成功。</w:t>
       </w:r>
     </w:p>
-    <w:bookmarkEnd w:id="42"/>
-    <w:bookmarkStart w:id="43" w:name="十一已经验证过的结果"/>
+    <w:bookmarkEnd w:id="47"/>
+    <w:bookmarkStart w:id="48" w:name="十一已经验证过的结果"/>
     <w:p>
       <w:pPr>
         <w:pStyle w:val="Heading2"/>
@@ -2484,9 +3584,36 @@
         </w:rPr>
         <w:t xml:space="preserve">9. 网页端提交后，Sheet 中能在 Submissions 标签看到记录。</w:t>
       </w:r>
-    </w:p>
-    <w:bookmarkEnd w:id="43"/>
-    <w:bookmarkStart w:id="44" w:name="十二当前限制"/>
+      <w:r>
+        <w:br/>
+      </w:r>
+      <w:r>
+        <w:rPr>
+          <w:rStyle w:val="VerbatimChar"/>
+        </w:rPr>
+        <w:t xml:space="preserve">10. Mobile 端直接打开 Drive 文件夹链接时，可能只显示“没有内容”且没有稳定上传入口。</w:t>
+      </w:r>
+      <w:r>
+        <w:br/>
+      </w:r>
+      <w:r>
+        <w:rPr>
+          <w:rStyle w:val="VerbatimChar"/>
+        </w:rPr>
+        <w:t xml:space="preserve">11. 当前 Mobile 端改为通过 Gmail 直接共享文件夹，再让用户在 Google Drive App 的“与我共享”中查找最新文件夹上传。</w:t>
+      </w:r>
+      <w:r>
+        <w:br/>
+      </w:r>
+      <w:r>
+        <w:rPr>
+          <w:rStyle w:val="VerbatimChar"/>
+        </w:rPr>
+        <w:t xml:space="preserve">12. GitHub Pages 部署已验证可以自动更新前端。</w:t>
+      </w:r>
+    </w:p>
+    <w:bookmarkEnd w:id="48"/>
+    <w:bookmarkStart w:id="49" w:name="十二当前限制"/>
     <w:p>
       <w:pPr>
         <w:pStyle w:val="Heading2"/>
@@ -2558,6 +3685,42 @@
         </w:rPr>
         <w:t xml:space="preserve">6. 如果用户不点击确认，Sheet 状态可能一直停留在 pending_upload。</w:t>
       </w:r>
+      <w:r>
+        <w:br/>
+      </w:r>
+      <w:r>
+        <w:rPr>
+          <w:rStyle w:val="VerbatimChar"/>
+        </w:rPr>
+        <w:t xml:space="preserve">7. Mobile 端依赖用户填写正确 Gmail，并且该 Gmail 与手机 Google Drive App 登录账号一致。</w:t>
+      </w:r>
+      <w:r>
+        <w:br/>
+      </w:r>
+      <w:r>
+        <w:rPr>
+          <w:rStyle w:val="VerbatimChar"/>
+        </w:rPr>
+        <w:t xml:space="preserve">8. Mobile 端“与我共享”中出现文件夹可能存在短暂延迟，用户可能需要刷新 Google Drive App。</w:t>
+      </w:r>
+      <w:r>
+        <w:br/>
+      </w:r>
+      <w:r>
+        <w:rPr>
+          <w:rStyle w:val="VerbatimChar"/>
+        </w:rPr>
+        <w:t xml:space="preserve">9. 如果 Google Workspace 管理员限制外部共享，folder.addEditor 或 anyone-with-link 权限可能无法达到预期。</w:t>
+      </w:r>
+      <w:r>
+        <w:br/>
+      </w:r>
+      <w:r>
+        <w:rPr>
+          <w:rStyle w:val="VerbatimChar"/>
+        </w:rPr>
+        <w:t xml:space="preserve">10. 邮件通知依赖 Apps Script 的 MailApp 授权和 Google 发送限制。</w:t>
+      </w:r>
     </w:p>
     <w:p>
       <w:pPr>
@@ -2596,8 +3759,8 @@
         <w:t xml:space="preserve">方案 C：Cloud Storage 直传，再同步到 Drive</w:t>
       </w:r>
     </w:p>
-    <w:bookmarkEnd w:id="44"/>
-    <w:bookmarkStart w:id="48" w:name="十三后续维护流程"/>
+    <w:bookmarkEnd w:id="49"/>
+    <w:bookmarkStart w:id="53" w:name="十三后续维护流程"/>
     <w:p>
       <w:pPr>
         <w:pStyle w:val="Heading2"/>
@@ -2606,7 +3769,7 @@
         <w:t xml:space="preserve">十三、后续维护流程</w:t>
       </w:r>
     </w:p>
-    <w:bookmarkStart w:id="45" w:name="修改网页前端"/>
+    <w:bookmarkStart w:id="50" w:name="修改网页前端"/>
     <w:p>
       <w:pPr>
         <w:pStyle w:val="Heading3"/>
@@ -2673,8 +3836,8 @@
         <w:t xml:space="preserve">，无需手动合并分支。</w:t>
       </w:r>
     </w:p>
-    <w:bookmarkEnd w:id="45"/>
-    <w:bookmarkStart w:id="46" w:name="修改-apps-script"/>
+    <w:bookmarkEnd w:id="50"/>
+    <w:bookmarkStart w:id="51" w:name="修改-apps-script"/>
     <w:p>
       <w:pPr>
         <w:pStyle w:val="Heading3"/>
@@ -2739,8 +3902,8 @@
         <w:t xml:space="preserve">6. 提交并推送代码</w:t>
       </w:r>
     </w:p>
-    <w:bookmarkEnd w:id="46"/>
-    <w:bookmarkStart w:id="47" w:name="修改文档"/>
+    <w:bookmarkEnd w:id="51"/>
+    <w:bookmarkStart w:id="52" w:name="修改文档"/>
     <w:p>
       <w:pPr>
         <w:pStyle w:val="Heading3"/>
@@ -2925,9 +4088,9 @@
         <w:t xml:space="preserve">docx</w:t>
       </w:r>
     </w:p>
-    <w:bookmarkEnd w:id="47"/>
-    <w:bookmarkEnd w:id="48"/>
-    <w:bookmarkEnd w:id="49"/>
+    <w:bookmarkEnd w:id="52"/>
+    <w:bookmarkEnd w:id="53"/>
+    <w:bookmarkEnd w:id="54"/>
     <w:sectPr/>
   </w:body>
 </w:document>

</xml_diff>

<commit_message>
Update upload scanner docs and Apps Script URL
</commit_message>
<xml_diff>
--- a/docs/simple-drive-link-implementation.docx
+++ b/docs/simple-drive-link-implementation.docx
@@ -2,7 +2,7 @@
 <file path=word/document.xml><?xml version="1.0" encoding="utf-8"?>
 <w:document xmlns:w="http://schemas.openxmlformats.org/wordprocessingml/2006/main" xmlns:m="http://schemas.openxmlformats.org/officeDocument/2006/math" xmlns:r="http://schemas.openxmlformats.org/officeDocument/2006/relationships" xmlns:o="urn:schemas-microsoft-com:office:office" xmlns:v="urn:schemas-microsoft-com:vml" xmlns:w10="urn:schemas-microsoft-com:office:word" xmlns:a="http://schemas.openxmlformats.org/drawingml/2006/main" xmlns:pic="http://schemas.openxmlformats.org/drawingml/2006/picture" xmlns:wp="http://schemas.openxmlformats.org/drawingml/2006/wordprocessingDrawing">
   <w:body>
-    <w:bookmarkStart w:id="54" w:name="最简-drive-链接上传方案实现说明"/>
+    <w:bookmarkStart w:id="55" w:name="最简-drive-链接上传方案实现说明"/>
     <w:p>
       <w:pPr>
         <w:pStyle w:val="Heading1"/>
@@ -118,16 +118,16 @@
         <w:rPr>
           <w:rStyle w:val="VerbatimChar"/>
         </w:rPr>
-        <w:t xml:space="preserve">-&gt; 用户回到网页点击“我已完成上传”</w:t>
-      </w:r>
-      <w:r>
-        <w:br/>
-      </w:r>
-      <w:r>
-        <w:rPr>
-          <w:rStyle w:val="VerbatimChar"/>
-        </w:rPr>
-        <w:t xml:space="preserve">-&gt; Apps Script 更新 Sheet 状态并标注 Drive 文件</w:t>
+        <w:t xml:space="preserve">-&gt; Apps Script 每 1 分钟自动扫描近期上传文件夹</w:t>
+      </w:r>
+      <w:r>
+        <w:br/>
+      </w:r>
+      <w:r>
+        <w:rPr>
+          <w:rStyle w:val="VerbatimChar"/>
+        </w:rPr>
+        <w:t xml:space="preserve">-&gt; Apps Script 自动更新 Sheet 状态、文件数量和 Drive 文件标注信息</w:t>
       </w:r>
     </w:p>
     <w:p>
@@ -460,7 +460,7 @@
         <w:rPr>
           <w:rStyle w:val="VerbatimChar"/>
         </w:rPr>
-        <w:t xml:space="preserve">https://script.google.com/macros/s/AKfycbyVAcJZKv-wesuIqbSS_YTjBOpj93EpdPWH6rBli61d71wCw0da1Myl5ahgCX6TBo9R/exec</w:t>
+        <w:t xml:space="preserve">https://script.google.com/macros/s/AKfycbxgDOx_FhQqFo6ZKUq6wPwBCG-mQVXU0no2eNCq4caMUjABWBAeLYzi8HhoE8aHV7OQ/exec</w:t>
       </w:r>
     </w:p>
     <w:p>
@@ -732,70 +732,52 @@
         <w:rPr>
           <w:rStyle w:val="VerbatimChar"/>
         </w:rPr>
-        <w:t xml:space="preserve">6. 前端显示 Submission ID 和“打开上传链接”按钮。</w:t>
-      </w:r>
-      <w:r>
-        <w:br/>
-      </w:r>
-      <w:r>
-        <w:rPr>
-          <w:rStyle w:val="VerbatimChar"/>
-        </w:rPr>
-        <w:t xml:space="preserve">7. “我已完成上传”按钮默认灰色且不可点击。</w:t>
-      </w:r>
-      <w:r>
-        <w:br/>
-      </w:r>
-      <w:r>
-        <w:rPr>
-          <w:rStyle w:val="VerbatimChar"/>
-        </w:rPr>
-        <w:t xml:space="preserve">8. 用户点击“打开上传链接”后进入 Google Drive 文件夹上传视频。</w:t>
-      </w:r>
-      <w:r>
-        <w:br/>
-      </w:r>
-      <w:r>
-        <w:rPr>
-          <w:rStyle w:val="VerbatimChar"/>
-        </w:rPr>
-        <w:t xml:space="preserve">9. 点击过上传链接后，“我已完成上传”按钮变为可点击。</w:t>
-      </w:r>
-      <w:r>
-        <w:br/>
-      </w:r>
-      <w:r>
-        <w:rPr>
-          <w:rStyle w:val="VerbatimChar"/>
-        </w:rPr>
-        <w:t xml:space="preserve">10. 用户上传视频后回到网页，点击“我已完成上传”。</w:t>
-      </w:r>
-      <w:r>
-        <w:br/>
-      </w:r>
-      <w:r>
-        <w:rPr>
-          <w:rStyle w:val="VerbatimChar"/>
-        </w:rPr>
-        <w:t xml:space="preserve">11. Apps Script 更新 Google Sheet 状态，并扫描/标注 Drive 文件。</w:t>
-      </w:r>
-      <w:r>
-        <w:br/>
-      </w:r>
-      <w:r>
-        <w:rPr>
-          <w:rStyle w:val="VerbatimChar"/>
-        </w:rPr>
-        <w:t xml:space="preserve">12. “我已完成上传”再次变为灰色不可点击。</w:t>
-      </w:r>
-      <w:r>
-        <w:br/>
-      </w:r>
-      <w:r>
-        <w:rPr>
-          <w:rStyle w:val="VerbatimChar"/>
-        </w:rPr>
-        <w:t xml:space="preserve">13. 上传链接按钮变为“继续上传”，继续打开同一个 Drive 文件夹。</w:t>
+        <w:t xml:space="preserve">6. 前端显示“打开上传链接”按钮。</w:t>
+      </w:r>
+      <w:r>
+        <w:br/>
+      </w:r>
+      <w:r>
+        <w:rPr>
+          <w:rStyle w:val="VerbatimChar"/>
+        </w:rPr>
+        <w:t xml:space="preserve">7. 用户点击“打开上传链接”后进入 Google Drive 文件夹上传一个或多个视频。</w:t>
+      </w:r>
+      <w:r>
+        <w:br/>
+      </w:r>
+      <w:r>
+        <w:rPr>
+          <w:rStyle w:val="VerbatimChar"/>
+        </w:rPr>
+        <w:t xml:space="preserve">8. 前端提示系统会自动检测上传状态，可能有 1-2 分钟延迟。</w:t>
+      </w:r>
+      <w:r>
+        <w:br/>
+      </w:r>
+      <w:r>
+        <w:rPr>
+          <w:rStyle w:val="VerbatimChar"/>
+        </w:rPr>
+        <w:t xml:space="preserve">9. Apps Script 定时触发器每 1 分钟扫描近期提交记录对应的 Drive 文件夹。</w:t>
+      </w:r>
+      <w:r>
+        <w:br/>
+      </w:r>
+      <w:r>
+        <w:rPr>
+          <w:rStyle w:val="VerbatimChar"/>
+        </w:rPr>
+        <w:t xml:space="preserve">10. 如果检测到文件，Apps Script 自动更新 Google Sheet 状态、文件数量和文件名列表，并标注 Drive 文件。</w:t>
+      </w:r>
+      <w:r>
+        <w:br/>
+      </w:r>
+      <w:r>
+        <w:rPr>
+          <w:rStyle w:val="VerbatimChar"/>
+        </w:rPr>
+        <w:t xml:space="preserve">11. 用户如需继续上传，可以再次打开同一个 Drive 文件夹，不会新建提交记录。</w:t>
       </w:r>
     </w:p>
     <w:bookmarkEnd w:id="28"/>
@@ -917,7 +899,7 @@
         <w:rPr>
           <w:rStyle w:val="VerbatimChar"/>
         </w:rPr>
-        <w:t xml:space="preserve">10. 前端显示 Submission ID 和 Google Drive App 操作步骤。</w:t>
+        <w:t xml:space="preserve">10. 前端显示 Google Drive App 操作步骤。</w:t>
       </w:r>
       <w:r>
         <w:br/>
@@ -962,16 +944,16 @@
         <w:rPr>
           <w:rStyle w:val="VerbatimChar"/>
         </w:rPr>
-        <w:t xml:space="preserve">15. 上传完成后回到网页，点击“我已完成上传”。</w:t>
-      </w:r>
-      <w:r>
-        <w:br/>
-      </w:r>
-      <w:r>
-        <w:rPr>
-          <w:rStyle w:val="VerbatimChar"/>
-        </w:rPr>
-        <w:t xml:space="preserve">16. Apps Script 更新 Google Sheet 状态，并扫描/标注 Drive 文件。</w:t>
+        <w:t xml:space="preserve">15. 前端提示系统会自动检测上传状态，可能有 1-2 分钟延迟。</w:t>
+      </w:r>
+      <w:r>
+        <w:br/>
+      </w:r>
+      <w:r>
+        <w:rPr>
+          <w:rStyle w:val="VerbatimChar"/>
+        </w:rPr>
+        <w:t xml:space="preserve">16. Apps Script 定时触发器自动扫描该文件夹，并更新 Google Sheet。</w:t>
       </w:r>
     </w:p>
     <w:p>
@@ -1096,7 +1078,19 @@
         <w:pStyle w:val="FirstParagraph"/>
       </w:pPr>
       <w:r>
-        <w:t xml:space="preserve">该流程对 PC 端仍然适用，但不再作为 Mobile 端主流程。</w:t>
+        <w:t xml:space="preserve">该流程已被当前自动扫描逻辑替代，不再要求用户点击</w:t>
+      </w:r>
+      <w:r>
+        <w:t xml:space="preserve">“</w:t>
+      </w:r>
+      <w:r>
+        <w:t xml:space="preserve">我已完成上传</w:t>
+      </w:r>
+      <w:r>
+        <w:t xml:space="preserve">”</w:t>
+      </w:r>
+      <w:r>
+        <w:t xml:space="preserve">。</w:t>
       </w:r>
     </w:p>
     <w:bookmarkEnd w:id="30"/>
@@ -1270,25 +1264,25 @@
         <w:rPr>
           <w:rStyle w:val="VerbatimChar"/>
         </w:rPr>
-        <w:t xml:space="preserve">2. 显示“复制链接”按钮。</w:t>
-      </w:r>
-      <w:r>
-        <w:br/>
-      </w:r>
-      <w:r>
-        <w:rPr>
-          <w:rStyle w:val="VerbatimChar"/>
-        </w:rPr>
-        <w:t xml:space="preserve">3. “我已完成上传”按钮默认灰色。</w:t>
-      </w:r>
-      <w:r>
-        <w:br/>
-      </w:r>
-      <w:r>
-        <w:rPr>
-          <w:rStyle w:val="VerbatimChar"/>
-        </w:rPr>
-        <w:t xml:space="preserve">4. 只有点击过“打开上传链接”或“继续上传”后，才能点击“我已完成上传”。</w:t>
+        <w:t xml:space="preserve">2. 不显示“复制链接”按钮。</w:t>
+      </w:r>
+      <w:r>
+        <w:br/>
+      </w:r>
+      <w:r>
+        <w:rPr>
+          <w:rStyle w:val="VerbatimChar"/>
+        </w:rPr>
+        <w:t xml:space="preserve">3. 不显示“我已完成上传”按钮。</w:t>
+      </w:r>
+      <w:r>
+        <w:br/>
+      </w:r>
+      <w:r>
+        <w:rPr>
+          <w:rStyle w:val="VerbatimChar"/>
+        </w:rPr>
+        <w:t xml:space="preserve">4. 提交成功后提示系统会自动检测上传状态，可能有 1-2 分钟延迟。</w:t>
       </w:r>
       <w:r>
         <w:br/>
@@ -1361,7 +1355,16 @@
         <w:rPr>
           <w:rStyle w:val="VerbatimChar"/>
         </w:rPr>
-        <w:t xml:space="preserve">6. “我已完成上传”按钮在提交成功后可用，用户需完成 Drive App 上传后再点击。</w:t>
+        <w:t xml:space="preserve">6. 不显示“我已完成上传”按钮。</w:t>
+      </w:r>
+      <w:r>
+        <w:br/>
+      </w:r>
+      <w:r>
+        <w:rPr>
+          <w:rStyle w:val="VerbatimChar"/>
+        </w:rPr>
+        <w:t xml:space="preserve">7. 提交成功后提示系统会自动检测上传状态，可能有 1-2 分钟延迟。</w:t>
       </w:r>
     </w:p>
     <w:p>
@@ -1529,38 +1532,64 @@
         <w:pStyle w:val="FirstParagraph"/>
       </w:pPr>
       <w:r>
-        <w:t xml:space="preserve">用户点击</w:t>
+        <w:t xml:space="preserve">如果用户需要继续上传，仍然使用同一个按钮打开原 Drive 子文件夹。按钮不会新建提交记录，也不会生成新的 Drive 文件夹。</w:t>
+      </w:r>
+    </w:p>
+    <w:p>
+      <w:pPr>
+        <w:pStyle w:val="BodyText"/>
+      </w:pPr>
+      <w:r>
+        <w:t xml:space="preserve">中文界面中对应显示为：</w:t>
+      </w:r>
+    </w:p>
+    <w:p>
+      <w:pPr>
+        <w:pStyle w:val="SourceCode"/>
+      </w:pPr>
+      <w:r>
+        <w:rPr>
+          <w:rStyle w:val="VerbatimChar"/>
+        </w:rPr>
+        <w:t xml:space="preserve">打开上传链接</w:t>
+      </w:r>
+    </w:p>
+    <w:p>
+      <w:pPr>
+        <w:pStyle w:val="FirstParagraph"/>
+      </w:pPr>
+      <w:r>
+        <w:t xml:space="preserve">Mobile 端不显示上传链接按钮。</w:t>
+      </w:r>
+    </w:p>
+    <w:bookmarkEnd w:id="35"/>
+    <w:bookmarkStart w:id="36" w:name="自动上传状态检测"/>
+    <w:p>
+      <w:pPr>
+        <w:pStyle w:val="Heading3"/>
+      </w:pPr>
+      <w:r>
+        <w:t xml:space="preserve">5. 自动上传状态检测</w:t>
+      </w:r>
+    </w:p>
+    <w:p>
+      <w:pPr>
+        <w:pStyle w:val="FirstParagraph"/>
+      </w:pPr>
+      <w:r>
+        <w:t xml:space="preserve">当前前端已经取消</w:t>
       </w:r>
       <w:r>
         <w:t xml:space="preserve">“</w:t>
       </w:r>
       <w:r>
-        <w:t xml:space="preserve">我已完成上传</w:t>
+        <w:t xml:space="preserve">我已完成上传 / I have finished uploading</w:t>
       </w:r>
       <w:r>
         <w:t xml:space="preserve">”</w:t>
       </w:r>
       <w:r>
-        <w:t xml:space="preserve">后，该按钮变为：</w:t>
-      </w:r>
-    </w:p>
-    <w:p>
-      <w:pPr>
-        <w:pStyle w:val="SourceCode"/>
-      </w:pPr>
-      <w:r>
-        <w:rPr>
-          <w:rStyle w:val="VerbatimChar"/>
-        </w:rPr>
-        <w:t xml:space="preserve">Continue uploading</w:t>
-      </w:r>
-    </w:p>
-    <w:p>
-      <w:pPr>
-        <w:pStyle w:val="FirstParagraph"/>
-      </w:pPr>
-      <w:r>
-        <w:t xml:space="preserve">两个状态打开的都是同一个 Google Drive 子文件夹，不会新建提交记录。</w:t>
+        <w:t xml:space="preserve">按钮。用户提交表单并进入 Drive 文件夹上传后，不需要再回到网页确认。</w:t>
       </w:r>
     </w:p>
     <w:p>
@@ -1568,168 +1597,37 @@
         <w:pStyle w:val="BodyText"/>
       </w:pPr>
       <w:r>
-        <w:t xml:space="preserve">Mobile 端不显示上传链接按钮。</w:t>
-      </w:r>
-    </w:p>
-    <w:bookmarkEnd w:id="35"/>
-    <w:bookmarkStart w:id="36" w:name="i-have-finished-uploading-按钮"/>
-    <w:p>
-      <w:pPr>
-        <w:pStyle w:val="Heading3"/>
-      </w:pPr>
-      <w:r>
-        <w:t xml:space="preserve">5.</w:t>
-      </w:r>
-      <w:r>
-        <w:t xml:space="preserve"> </w:t>
-      </w:r>
-      <w:r>
-        <w:t xml:space="preserve">“</w:t>
-      </w:r>
-      <w:r>
-        <w:t xml:space="preserve">I have finished uploading</w:t>
-      </w:r>
-      <w:r>
-        <w:t xml:space="preserve">”</w:t>
-      </w:r>
-      <w:r>
-        <w:t xml:space="preserve"> </w:t>
-      </w:r>
-      <w:r>
-        <w:t xml:space="preserve">按钮</w:t>
-      </w:r>
-    </w:p>
-    <w:p>
-      <w:pPr>
-        <w:pStyle w:val="FirstParagraph"/>
-      </w:pPr>
-      <w:r>
-        <w:t xml:space="preserve">PC 端默认状态：</w:t>
-      </w:r>
-    </w:p>
-    <w:p>
-      <w:pPr>
-        <w:pStyle w:val="SourceCode"/>
-      </w:pPr>
-      <w:r>
-        <w:rPr>
-          <w:rStyle w:val="VerbatimChar"/>
-        </w:rPr>
-        <w:t xml:space="preserve">灰色，不可点击</w:t>
-      </w:r>
-    </w:p>
-    <w:p>
-      <w:pPr>
-        <w:pStyle w:val="FirstParagraph"/>
-      </w:pPr>
-      <w:r>
-        <w:t xml:space="preserve">点击过</w:t>
-      </w:r>
-      <w:r>
-        <w:t xml:space="preserve"> </w:t>
-      </w:r>
-      <w:r>
-        <w:rPr>
-          <w:rStyle w:val="VerbatimChar"/>
-        </w:rPr>
-        <w:t xml:space="preserve">Open upload link</w:t>
-      </w:r>
-      <w:r>
-        <w:t xml:space="preserve"> </w:t>
-      </w:r>
-      <w:r>
-        <w:t xml:space="preserve">或</w:t>
-      </w:r>
-      <w:r>
-        <w:t xml:space="preserve"> </w:t>
-      </w:r>
-      <w:r>
-        <w:rPr>
-          <w:rStyle w:val="VerbatimChar"/>
-        </w:rPr>
-        <w:t xml:space="preserve">Continue uploading</w:t>
-      </w:r>
-      <w:r>
-        <w:t xml:space="preserve"> </w:t>
-      </w:r>
-      <w:r>
-        <w:t xml:space="preserve">后：</w:t>
-      </w:r>
-    </w:p>
-    <w:p>
-      <w:pPr>
-        <w:pStyle w:val="SourceCode"/>
-      </w:pPr>
-      <w:r>
-        <w:rPr>
-          <w:rStyle w:val="VerbatimChar"/>
-        </w:rPr>
-        <w:t xml:space="preserve">变为正常颜色，可点击</w:t>
-      </w:r>
-    </w:p>
-    <w:p>
-      <w:pPr>
-        <w:pStyle w:val="FirstParagraph"/>
-      </w:pPr>
-      <w:r>
-        <w:t xml:space="preserve">点击确认完成并成功更新 Sheet 后：</w:t>
-      </w:r>
-    </w:p>
-    <w:p>
-      <w:pPr>
-        <w:pStyle w:val="SourceCode"/>
-      </w:pPr>
-      <w:r>
-        <w:rPr>
-          <w:rStyle w:val="VerbatimChar"/>
-        </w:rPr>
-        <w:t xml:space="preserve">再次变为灰色，不可点击</w:t>
-      </w:r>
-    </w:p>
-    <w:p>
-      <w:pPr>
-        <w:pStyle w:val="FirstParagraph"/>
-      </w:pPr>
-      <w:r>
-        <w:t xml:space="preserve">Mobile 端：</w:t>
-      </w:r>
-    </w:p>
-    <w:p>
-      <w:pPr>
-        <w:pStyle w:val="SourceCode"/>
-      </w:pPr>
-      <w:r>
-        <w:rPr>
-          <w:rStyle w:val="VerbatimChar"/>
-        </w:rPr>
-        <w:t xml:space="preserve">提交成功后可点击。</w:t>
-      </w:r>
-      <w:r>
-        <w:br/>
-      </w:r>
-      <w:r>
-        <w:rPr>
-          <w:rStyle w:val="VerbatimChar"/>
-        </w:rPr>
-        <w:t xml:space="preserve">用户应先在 Google Drive App 的“与我共享”中找到最新共享文件夹并上传视频。</w:t>
-      </w:r>
-      <w:r>
-        <w:br/>
-      </w:r>
-      <w:r>
-        <w:rPr>
-          <w:rStyle w:val="VerbatimChar"/>
-        </w:rPr>
-        <w:t xml:space="preserve">上传完成后回到网页点击该按钮。</w:t>
-      </w:r>
-      <w:r>
-        <w:br/>
-      </w:r>
-      <w:r>
-        <w:rPr>
-          <w:rStyle w:val="VerbatimChar"/>
-        </w:rPr>
-        <w:t xml:space="preserve">点击确认完成并成功更新 Sheet 后，再次变为灰色不可点击。</w:t>
+        <w:t xml:space="preserve">页面会提示：</w:t>
+      </w:r>
+    </w:p>
+    <w:p>
+      <w:pPr>
+        <w:pStyle w:val="SourceCode"/>
+      </w:pPr>
+      <w:r>
+        <w:rPr>
+          <w:rStyle w:val="VerbatimChar"/>
+        </w:rPr>
+        <w:t xml:space="preserve">The system will automatically detect the upload status, with a possible 1-2 minute delay.</w:t>
+      </w:r>
+    </w:p>
+    <w:p>
+      <w:pPr>
+        <w:pStyle w:val="FirstParagraph"/>
+      </w:pPr>
+      <w:r>
+        <w:t xml:space="preserve">中文界面中对应提示为：</w:t>
+      </w:r>
+    </w:p>
+    <w:p>
+      <w:pPr>
+        <w:pStyle w:val="SourceCode"/>
+      </w:pPr>
+      <w:r>
+        <w:rPr>
+          <w:rStyle w:val="VerbatimChar"/>
+        </w:rPr>
+        <w:t xml:space="preserve">系统会自动检测上传状态，可能有 1-2 分钟延迟。</w:t>
       </w:r>
     </w:p>
     <w:bookmarkEnd w:id="36"/>
@@ -1758,7 +1656,7 @@
         <w:rPr>
           <w:rStyle w:val="VerbatimChar"/>
         </w:rPr>
-        <w:t xml:space="preserve">Information submitted. Upload now.</w:t>
+        <w:t xml:space="preserve">Information submitted. Upload now. The system will automatically detect the upload status, with a possible 1-2 minute delay.</w:t>
       </w:r>
     </w:p>
     <w:p>
@@ -1777,7 +1675,7 @@
         <w:rPr>
           <w:rStyle w:val="VerbatimChar"/>
         </w:rPr>
-        <w:t xml:space="preserve">信息已提交，请现在上传。</w:t>
+        <w:t xml:space="preserve">信息已提交，请现在上传。系统会自动检测上传状态，可能有 1-2 分钟延迟。</w:t>
       </w:r>
     </w:p>
     <w:p>
@@ -1838,7 +1736,7 @@
         <w:t xml:space="preserve"> </w:t>
       </w:r>
       <w:r>
-        <w:t xml:space="preserve">链接，避免和主上传按钮重复。</w:t>
+        <w:t xml:space="preserve">链接，避免和主上传按钮重复。前端也不再显示提交编号，提交编号只保留在 Google Sheet 和 Drive 文件/文件夹标注中。</w:t>
       </w:r>
     </w:p>
     <w:p>
@@ -1975,7 +1873,7 @@
         <w:rPr>
           <w:rStyle w:val="VerbatimChar"/>
         </w:rPr>
-        <w:t xml:space="preserve">completed_at</w:t>
+        <w:t xml:space="preserve">firstDetected_at</w:t>
       </w:r>
       <w:r>
         <w:br/>
@@ -2084,7 +1982,7 @@
         <w:rPr>
           <w:rStyle w:val="VerbatimChar"/>
         </w:rPr>
-        <w:t xml:space="preserve">completed_at        用户点击“我已完成上传”的时间</w:t>
+        <w:t xml:space="preserve">firstDetected_at    第一次自动检测到该文件夹已有上传文件的时间</w:t>
       </w:r>
       <w:r>
         <w:br/>
@@ -2111,7 +2009,7 @@
         <w:rPr>
           <w:rStyle w:val="VerbatimChar"/>
         </w:rPr>
-        <w:t xml:space="preserve">annotated_at        文件夹/文件标注时间</w:t>
+        <w:t xml:space="preserve">annotated_at        最近一次自动扫描和标注时间</w:t>
       </w:r>
       <w:r>
         <w:br/>
@@ -2128,6 +2026,60 @@
         <w:pStyle w:val="FirstParagraph"/>
       </w:pPr>
       <w:r>
+        <w:t xml:space="preserve">时间字段显示格式统一为分钟级：</w:t>
+      </w:r>
+    </w:p>
+    <w:p>
+      <w:pPr>
+        <w:pStyle w:val="SourceCode"/>
+      </w:pPr>
+      <w:r>
+        <w:rPr>
+          <w:rStyle w:val="VerbatimChar"/>
+        </w:rPr>
+        <w:t xml:space="preserve">yyyy-mm-dd hh:mm</w:t>
+      </w:r>
+    </w:p>
+    <w:p>
+      <w:pPr>
+        <w:pStyle w:val="FirstParagraph"/>
+      </w:pPr>
+      <w:r>
+        <w:t xml:space="preserve">其中</w:t>
+      </w:r>
+      <w:r>
+        <w:t xml:space="preserve"> </w:t>
+      </w:r>
+      <w:r>
+        <w:rPr>
+          <w:rStyle w:val="VerbatimChar"/>
+        </w:rPr>
+        <w:t xml:space="preserve">annotated_at</w:t>
+      </w:r>
+      <w:r>
+        <w:t xml:space="preserve"> </w:t>
+      </w:r>
+      <w:r>
+        <w:t xml:space="preserve">适合用来判断 Apps Script 定时扫描是否正在运行；</w:t>
+      </w:r>
+      <w:r>
+        <w:rPr>
+          <w:rStyle w:val="VerbatimChar"/>
+        </w:rPr>
+        <w:t xml:space="preserve">firstDetected_at</w:t>
+      </w:r>
+      <w:r>
+        <w:t xml:space="preserve"> </w:t>
+      </w:r>
+      <w:r>
+        <w:t xml:space="preserve">只在第一次发现视频文件时写入，后续扫描不会覆盖。</w:t>
+      </w:r>
+    </w:p>
+    <w:p>
+      <w:pPr>
+        <w:pStyle w:val="BodyText"/>
+      </w:pPr>
+      <w:r>
         <w:rPr>
           <w:rStyle w:val="VerbatimChar"/>
         </w:rPr>
@@ -2238,7 +2190,7 @@
         <w:rPr>
           <w:rStyle w:val="VerbatimChar"/>
         </w:rPr>
-        <w:t xml:space="preserve">user_confirmed      用户已点击“我已完成上传”</w:t>
+        <w:t xml:space="preserve">uploaded_detected   自动扫描已检测到上传文件</w:t>
       </w:r>
     </w:p>
     <w:bookmarkEnd w:id="39"/>
@@ -2467,25 +2419,13 @@
       </w:r>
     </w:p>
     <w:bookmarkEnd w:id="40"/>
-    <w:bookmarkStart w:id="41" w:name="用户点击我已完成上传时"/>
+    <w:bookmarkStart w:id="41" w:name="自动扫描上传文件时"/>
     <w:p>
       <w:pPr>
         <w:pStyle w:val="Heading3"/>
       </w:pPr>
       <w:r>
-        <w:t xml:space="preserve">2. 用户点击</w:t>
-      </w:r>
-      <w:r>
-        <w:t xml:space="preserve">“</w:t>
-      </w:r>
-      <w:r>
-        <w:t xml:space="preserve">我已完成上传</w:t>
-      </w:r>
-      <w:r>
-        <w:t xml:space="preserve">”</w:t>
-      </w:r>
-      <w:r>
-        <w:t xml:space="preserve">时</w:t>
+        <w:t xml:space="preserve">2. 自动扫描上传文件时</w:t>
       </w:r>
     </w:p>
     <w:p>
@@ -2504,70 +2444,97 @@
         <w:rPr>
           <w:rStyle w:val="VerbatimChar"/>
         </w:rPr>
-        <w:t xml:space="preserve">1. 根据 submission_id 找到 Sheet 中对应行。</w:t>
-      </w:r>
-      <w:r>
-        <w:br/>
-      </w:r>
-      <w:r>
-        <w:rPr>
-          <w:rStyle w:val="VerbatimChar"/>
-        </w:rPr>
-        <w:t xml:space="preserve">2. 找到该行对应的 Drive 子文件夹。</w:t>
-      </w:r>
-      <w:r>
-        <w:br/>
-      </w:r>
-      <w:r>
-        <w:rPr>
-          <w:rStyle w:val="VerbatimChar"/>
-        </w:rPr>
-        <w:t xml:space="preserve">3. 扫描该文件夹中的文件。</w:t>
-      </w:r>
-      <w:r>
-        <w:br/>
-      </w:r>
-      <w:r>
-        <w:rPr>
-          <w:rStyle w:val="VerbatimChar"/>
-        </w:rPr>
-        <w:t xml:space="preserve">4. 给每个文件写入描述信息。</w:t>
-      </w:r>
-      <w:r>
-        <w:br/>
-      </w:r>
-      <w:r>
-        <w:rPr>
-          <w:rStyle w:val="VerbatimChar"/>
-        </w:rPr>
-        <w:t xml:space="preserve">5. 统计文件数量并写回 file_count。</w:t>
-      </w:r>
-      <w:r>
-        <w:br/>
-      </w:r>
-      <w:r>
-        <w:rPr>
-          <w:rStyle w:val="VerbatimChar"/>
-        </w:rPr>
-        <w:t xml:space="preserve">6. 把文件名列表写回 upload_file_names。</w:t>
-      </w:r>
-      <w:r>
-        <w:br/>
-      </w:r>
-      <w:r>
-        <w:rPr>
-          <w:rStyle w:val="VerbatimChar"/>
-        </w:rPr>
-        <w:t xml:space="preserve">7. 把标注时间写回 annotated_at。</w:t>
-      </w:r>
-      <w:r>
-        <w:br/>
-      </w:r>
-      <w:r>
-        <w:rPr>
-          <w:rStyle w:val="VerbatimChar"/>
-        </w:rPr>
-        <w:t xml:space="preserve">8. 把状态更新为 user_confirmed。</w:t>
+        <w:t xml:space="preserve">1. 每 1 分钟由 Apps Script 时间触发器运行 scanRecentUploadFolders。</w:t>
+      </w:r>
+      <w:r>
+        <w:br/>
+      </w:r>
+      <w:r>
+        <w:rPr>
+          <w:rStyle w:val="VerbatimChar"/>
+        </w:rPr>
+        <w:t xml:space="preserve">2. 只扫描最近 7 天内提交、且 status 为 pending_upload 或 uploaded_detected 的记录。</w:t>
+      </w:r>
+      <w:r>
+        <w:br/>
+      </w:r>
+      <w:r>
+        <w:rPr>
+          <w:rStyle w:val="VerbatimChar"/>
+        </w:rPr>
+        <w:t xml:space="preserve">3. 根据 submission_id 找到 Sheet 中对应行。</w:t>
+      </w:r>
+      <w:r>
+        <w:br/>
+      </w:r>
+      <w:r>
+        <w:rPr>
+          <w:rStyle w:val="VerbatimChar"/>
+        </w:rPr>
+        <w:t xml:space="preserve">4. 找到该行对应的 Drive 子文件夹。</w:t>
+      </w:r>
+      <w:r>
+        <w:br/>
+      </w:r>
+      <w:r>
+        <w:rPr>
+          <w:rStyle w:val="VerbatimChar"/>
+        </w:rPr>
+        <w:t xml:space="preserve">5. 扫描该文件夹中的文件。</w:t>
+      </w:r>
+      <w:r>
+        <w:br/>
+      </w:r>
+      <w:r>
+        <w:rPr>
+          <w:rStyle w:val="VerbatimChar"/>
+        </w:rPr>
+        <w:t xml:space="preserve">6. 给文件夹和每个文件写入描述信息。</w:t>
+      </w:r>
+      <w:r>
+        <w:br/>
+      </w:r>
+      <w:r>
+        <w:rPr>
+          <w:rStyle w:val="VerbatimChar"/>
+        </w:rPr>
+        <w:t xml:space="preserve">7. 统计文件数量并写回 file_count。</w:t>
+      </w:r>
+      <w:r>
+        <w:br/>
+      </w:r>
+      <w:r>
+        <w:rPr>
+          <w:rStyle w:val="VerbatimChar"/>
+        </w:rPr>
+        <w:t xml:space="preserve">8. 把文件名列表写回 upload_file_names。</w:t>
+      </w:r>
+      <w:r>
+        <w:br/>
+      </w:r>
+      <w:r>
+        <w:rPr>
+          <w:rStyle w:val="VerbatimChar"/>
+        </w:rPr>
+        <w:t xml:space="preserve">9. 把最近扫描时间写回 annotated_at。</w:t>
+      </w:r>
+      <w:r>
+        <w:br/>
+      </w:r>
+      <w:r>
+        <w:rPr>
+          <w:rStyle w:val="VerbatimChar"/>
+        </w:rPr>
+        <w:t xml:space="preserve">10. 如果第一次发现 file_count &gt; 0，则写入 firstDetected_at。</w:t>
+      </w:r>
+      <w:r>
+        <w:br/>
+      </w:r>
+      <w:r>
+        <w:rPr>
+          <w:rStyle w:val="VerbatimChar"/>
+        </w:rPr>
+        <w:t xml:space="preserve">11. 如果检测到文件，则把 status 更新为 uploaded_detected；否则保持 pending_upload。</w:t>
       </w:r>
     </w:p>
     <w:p>
@@ -2655,7 +2622,7 @@
     </w:p>
     <w:bookmarkEnd w:id="41"/>
     <w:bookmarkEnd w:id="42"/>
-    <w:bookmarkStart w:id="45" w:name="八apps-script-关键配置"/>
+    <w:bookmarkStart w:id="46" w:name="八apps-script-关键配置"/>
     <w:p>
       <w:pPr>
         <w:pStyle w:val="Heading2"/>
@@ -2883,13 +2850,393 @@
         </w:rPr>
         <w:t xml:space="preserve">;</w:t>
       </w:r>
-    </w:p>
-    <w:bookmarkStart w:id="43" w:name="gmail-共享和邮件通知"/>
+      <w:r>
+        <w:br/>
+      </w:r>
+      <w:r>
+        <w:rPr>
+          <w:rStyle w:val="KeywordTok"/>
+        </w:rPr>
+        <w:t xml:space="preserve">const</w:t>
+      </w:r>
+      <w:r>
+        <w:rPr>
+          <w:rStyle w:val="NormalTok"/>
+        </w:rPr>
+        <w:t xml:space="preserve"> UPLOAD_SCAN_WINDOW_DAYS </w:t>
+      </w:r>
+      <w:r>
+        <w:rPr>
+          <w:rStyle w:val="OperatorTok"/>
+        </w:rPr>
+        <w:t xml:space="preserve">=</w:t>
+      </w:r>
+      <w:r>
+        <w:rPr>
+          <w:rStyle w:val="NormalTok"/>
+        </w:rPr>
+        <w:t xml:space="preserve"> </w:t>
+      </w:r>
+      <w:r>
+        <w:rPr>
+          <w:rStyle w:val="DecValTok"/>
+        </w:rPr>
+        <w:t xml:space="preserve">7</w:t>
+      </w:r>
+      <w:r>
+        <w:rPr>
+          <w:rStyle w:val="OperatorTok"/>
+        </w:rPr>
+        <w:t xml:space="preserve">;</w:t>
+      </w:r>
+      <w:r>
+        <w:br/>
+      </w:r>
+      <w:r>
+        <w:rPr>
+          <w:rStyle w:val="KeywordTok"/>
+        </w:rPr>
+        <w:t xml:space="preserve">const</w:t>
+      </w:r>
+      <w:r>
+        <w:rPr>
+          <w:rStyle w:val="NormalTok"/>
+        </w:rPr>
+        <w:t xml:space="preserve"> AUTO_SCAN_STATUSES </w:t>
+      </w:r>
+      <w:r>
+        <w:rPr>
+          <w:rStyle w:val="OperatorTok"/>
+        </w:rPr>
+        <w:t xml:space="preserve">=</w:t>
+      </w:r>
+      <w:r>
+        <w:rPr>
+          <w:rStyle w:val="NormalTok"/>
+        </w:rPr>
+        <w:t xml:space="preserve"> [</w:t>
+      </w:r>
+      <w:r>
+        <w:rPr>
+          <w:rStyle w:val="StringTok"/>
+        </w:rPr>
+        <w:t xml:space="preserve">'pending_upload'</w:t>
+      </w:r>
+      <w:r>
+        <w:rPr>
+          <w:rStyle w:val="OperatorTok"/>
+        </w:rPr>
+        <w:t xml:space="preserve">,</w:t>
+      </w:r>
+      <w:r>
+        <w:rPr>
+          <w:rStyle w:val="NormalTok"/>
+        </w:rPr>
+        <w:t xml:space="preserve"> </w:t>
+      </w:r>
+      <w:r>
+        <w:rPr>
+          <w:rStyle w:val="StringTok"/>
+        </w:rPr>
+        <w:t xml:space="preserve">'uploaded_detected'</w:t>
+      </w:r>
+      <w:r>
+        <w:rPr>
+          <w:rStyle w:val="NormalTok"/>
+        </w:rPr>
+        <w:t xml:space="preserve">]</w:t>
+      </w:r>
+      <w:r>
+        <w:rPr>
+          <w:rStyle w:val="OperatorTok"/>
+        </w:rPr>
+        <w:t xml:space="preserve">;</w:t>
+      </w:r>
+      <w:r>
+        <w:br/>
+      </w:r>
+      <w:r>
+        <w:rPr>
+          <w:rStyle w:val="KeywordTok"/>
+        </w:rPr>
+        <w:t xml:space="preserve">const</w:t>
+      </w:r>
+      <w:r>
+        <w:rPr>
+          <w:rStyle w:val="NormalTok"/>
+        </w:rPr>
+        <w:t xml:space="preserve"> SHEET_DATETIME_FORMAT </w:t>
+      </w:r>
+      <w:r>
+        <w:rPr>
+          <w:rStyle w:val="OperatorTok"/>
+        </w:rPr>
+        <w:t xml:space="preserve">=</w:t>
+      </w:r>
+      <w:r>
+        <w:rPr>
+          <w:rStyle w:val="NormalTok"/>
+        </w:rPr>
+        <w:t xml:space="preserve"> </w:t>
+      </w:r>
+      <w:r>
+        <w:rPr>
+          <w:rStyle w:val="StringTok"/>
+        </w:rPr>
+        <w:t xml:space="preserve">'yyyy-mm-dd hh:mm'</w:t>
+      </w:r>
+      <w:r>
+        <w:rPr>
+          <w:rStyle w:val="OperatorTok"/>
+        </w:rPr>
+        <w:t xml:space="preserve">;</w:t>
+      </w:r>
+    </w:p>
+    <w:bookmarkStart w:id="43" w:name="自动扫描触发器"/>
     <w:p>
       <w:pPr>
         <w:pStyle w:val="Heading3"/>
       </w:pPr>
       <w:r>
+        <w:t xml:space="preserve">自动扫描触发器</w:t>
+      </w:r>
+    </w:p>
+    <w:p>
+      <w:pPr>
+        <w:pStyle w:val="FirstParagraph"/>
+      </w:pPr>
+      <w:r>
+        <w:t xml:space="preserve">当前自动扫描入口函数是：</w:t>
+      </w:r>
+    </w:p>
+    <w:p>
+      <w:pPr>
+        <w:pStyle w:val="SourceCode"/>
+      </w:pPr>
+      <w:r>
+        <w:rPr>
+          <w:rStyle w:val="FunctionTok"/>
+        </w:rPr>
+        <w:t xml:space="preserve">scanRecentUploadFolders</w:t>
+      </w:r>
+      <w:r>
+        <w:rPr>
+          <w:rStyle w:val="NormalTok"/>
+        </w:rPr>
+        <w:t xml:space="preserve">()</w:t>
+      </w:r>
+    </w:p>
+    <w:p>
+      <w:pPr>
+        <w:pStyle w:val="FirstParagraph"/>
+      </w:pPr>
+      <w:r>
+        <w:t xml:space="preserve">该函数不会由 Web App URL 自动定时运行，需要在 Apps Script 中先运行一次：</w:t>
+      </w:r>
+    </w:p>
+    <w:p>
+      <w:pPr>
+        <w:pStyle w:val="SourceCode"/>
+      </w:pPr>
+      <w:r>
+        <w:rPr>
+          <w:rStyle w:val="FunctionTok"/>
+        </w:rPr>
+        <w:t xml:space="preserve">setupUploadScannerTrigger</w:t>
+      </w:r>
+      <w:r>
+        <w:rPr>
+          <w:rStyle w:val="NormalTok"/>
+        </w:rPr>
+        <w:t xml:space="preserve">()</w:t>
+      </w:r>
+    </w:p>
+    <w:p>
+      <w:pPr>
+        <w:pStyle w:val="FirstParagraph"/>
+      </w:pPr>
+      <w:r>
+        <w:t xml:space="preserve">运行并授权后，Apps Script 会创建一个每 1 分钟执行一次的时间触发器。可以在 Apps Script 左侧的 Triggers / 触发器页面查看是否存在</w:t>
+      </w:r>
+      <w:r>
+        <w:t xml:space="preserve"> </w:t>
+      </w:r>
+      <w:r>
+        <w:rPr>
+          <w:rStyle w:val="VerbatimChar"/>
+        </w:rPr>
+        <w:t xml:space="preserve">scanRecentUploadFolders</w:t>
+      </w:r>
+      <w:r>
+        <w:t xml:space="preserve"> </w:t>
+      </w:r>
+      <w:r>
+        <w:t xml:space="preserve">的定时触发器。</w:t>
+      </w:r>
+    </w:p>
+    <w:p>
+      <w:pPr>
+        <w:pStyle w:val="BodyText"/>
+      </w:pPr>
+      <w:r>
+        <w:t xml:space="preserve">注意：部署新的 Web App URL 不会自动创建定时触发器。每次新建或更换 Apps Script 项目时，都需要至少手动运行一次</w:t>
+      </w:r>
+      <w:r>
+        <w:t xml:space="preserve"> </w:t>
+      </w:r>
+      <w:r>
+        <w:rPr>
+          <w:rStyle w:val="VerbatimChar"/>
+        </w:rPr>
+        <w:t xml:space="preserve">setupUploadScannerTrigger()</w:t>
+      </w:r>
+      <w:r>
+        <w:t xml:space="preserve">，否则</w:t>
+      </w:r>
+      <w:r>
+        <w:t xml:space="preserve"> </w:t>
+      </w:r>
+      <w:r>
+        <w:rPr>
+          <w:rStyle w:val="VerbatimChar"/>
+        </w:rPr>
+        <w:t xml:space="preserve">scanRecentUploadFolders()</w:t>
+      </w:r>
+      <w:r>
+        <w:t xml:space="preserve"> </w:t>
+      </w:r>
+      <w:r>
+        <w:t xml:space="preserve">不会自动每分钟执行。</w:t>
+      </w:r>
+    </w:p>
+    <w:p>
+      <w:pPr>
+        <w:pStyle w:val="BodyText"/>
+      </w:pPr>
+      <w:r>
+        <w:t xml:space="preserve">如果需要手动测试扫描是否正常，可以直接在 Apps Script 编辑器中运行：</w:t>
+      </w:r>
+    </w:p>
+    <w:p>
+      <w:pPr>
+        <w:pStyle w:val="SourceCode"/>
+      </w:pPr>
+      <w:r>
+        <w:rPr>
+          <w:rStyle w:val="FunctionTok"/>
+        </w:rPr>
+        <w:t xml:space="preserve">scanRecentUploadFolders</w:t>
+      </w:r>
+      <w:r>
+        <w:rPr>
+          <w:rStyle w:val="NormalTok"/>
+        </w:rPr>
+        <w:t xml:space="preserve">()</w:t>
+      </w:r>
+    </w:p>
+    <w:p>
+      <w:pPr>
+        <w:pStyle w:val="FirstParagraph"/>
+      </w:pPr>
+      <w:r>
+        <w:t xml:space="preserve">运行后查看 Google Sheet 中的</w:t>
+      </w:r>
+      <w:r>
+        <w:t xml:space="preserve"> </w:t>
+      </w:r>
+      <w:r>
+        <w:rPr>
+          <w:rStyle w:val="VerbatimChar"/>
+        </w:rPr>
+        <w:t xml:space="preserve">annotated_at</w:t>
+      </w:r>
+      <w:r>
+        <w:t xml:space="preserve"> </w:t>
+      </w:r>
+      <w:r>
+        <w:t xml:space="preserve">是否更新到分钟级时间。如果对应 Drive 子文件夹已有文件，还应看到</w:t>
+      </w:r>
+      <w:r>
+        <w:t xml:space="preserve"> </w:t>
+      </w:r>
+      <w:r>
+        <w:rPr>
+          <w:rStyle w:val="VerbatimChar"/>
+        </w:rPr>
+        <w:t xml:space="preserve">file_count</w:t>
+      </w:r>
+      <w:r>
+        <w:t xml:space="preserve">、</w:t>
+      </w:r>
+      <w:r>
+        <w:rPr>
+          <w:rStyle w:val="VerbatimChar"/>
+        </w:rPr>
+        <w:t xml:space="preserve">upload_file_names</w:t>
+      </w:r>
+      <w:r>
+        <w:t xml:space="preserve">、</w:t>
+      </w:r>
+      <w:r>
+        <w:rPr>
+          <w:rStyle w:val="VerbatimChar"/>
+        </w:rPr>
+        <w:t xml:space="preserve">status</w:t>
+      </w:r>
+      <w:r>
+        <w:t xml:space="preserve"> </w:t>
+      </w:r>
+      <w:r>
+        <w:t xml:space="preserve">和</w:t>
+      </w:r>
+      <w:r>
+        <w:t xml:space="preserve"> </w:t>
+      </w:r>
+      <w:r>
+        <w:rPr>
+          <w:rStyle w:val="VerbatimChar"/>
+        </w:rPr>
+        <w:t xml:space="preserve">firstDetected_at</w:t>
+      </w:r>
+      <w:r>
+        <w:t xml:space="preserve"> </w:t>
+      </w:r>
+      <w:r>
+        <w:t xml:space="preserve">更新。</w:t>
+      </w:r>
+    </w:p>
+    <w:p>
+      <w:pPr>
+        <w:pStyle w:val="BodyText"/>
+      </w:pPr>
+      <w:r>
+        <w:t xml:space="preserve">如果需要删除自动扫描触发器，可以运行：</w:t>
+      </w:r>
+    </w:p>
+    <w:p>
+      <w:pPr>
+        <w:pStyle w:val="SourceCode"/>
+      </w:pPr>
+      <w:r>
+        <w:rPr>
+          <w:rStyle w:val="FunctionTok"/>
+        </w:rPr>
+        <w:t xml:space="preserve">removeUploadScannerTrigger</w:t>
+      </w:r>
+      <w:r>
+        <w:rPr>
+          <w:rStyle w:val="NormalTok"/>
+        </w:rPr>
+        <w:t xml:space="preserve">()</w:t>
+      </w:r>
+    </w:p>
+    <w:bookmarkEnd w:id="43"/>
+    <w:bookmarkStart w:id="44" w:name="gmail-共享和邮件通知"/>
+    <w:p>
+      <w:pPr>
+        <w:pStyle w:val="Heading3"/>
+      </w:pPr>
+      <w:r>
         <w:t xml:space="preserve">Gmail 共享和邮件通知</w:t>
       </w:r>
     </w:p>
@@ -3107,8 +3454,8 @@
         <w:t xml:space="preserve">相关逻辑，Apps Script 可能要求重新授权邮件发送权限。</w:t>
       </w:r>
     </w:p>
-    <w:bookmarkEnd w:id="43"/>
-    <w:bookmarkStart w:id="44" w:name="重新部署-apps-script-的注意事项"/>
+    <w:bookmarkEnd w:id="44"/>
+    <w:bookmarkStart w:id="45" w:name="重新部署-apps-script-的注意事项"/>
     <w:p>
       <w:pPr>
         <w:pStyle w:val="Heading3"/>
@@ -3189,9 +3536,9 @@
         <w:t xml:space="preserve">地址可能仍然运行旧版本代码。</w:t>
       </w:r>
     </w:p>
-    <w:bookmarkEnd w:id="44"/>
     <w:bookmarkEnd w:id="45"/>
-    <w:bookmarkStart w:id="46" w:name="九为什么使用隐藏-iframe-提交"/>
+    <w:bookmarkEnd w:id="46"/>
+    <w:bookmarkStart w:id="47" w:name="九为什么使用隐藏-iframe-提交"/>
     <w:p>
       <w:pPr>
         <w:pStyle w:val="Heading2"/>
@@ -3344,8 +3691,8 @@
         <w:t xml:space="preserve">前端现在把字段作为普通表单字段提交，而不是只提交 JSON 字符串，避免不同环境下 JSON 解码不一致导致无法写入 Sheet。</w:t>
       </w:r>
     </w:p>
-    <w:bookmarkEnd w:id="46"/>
-    <w:bookmarkStart w:id="47" w:name="十github-pages-自动部署"/>
+    <w:bookmarkEnd w:id="47"/>
+    <w:bookmarkStart w:id="48" w:name="十github-pages-自动部署"/>
     <w:p>
       <w:pPr>
         <w:pStyle w:val="Heading2"/>
@@ -3484,8 +3831,8 @@
         <w:t xml:space="preserve">分支，部署成功。</w:t>
       </w:r>
     </w:p>
-    <w:bookmarkEnd w:id="47"/>
-    <w:bookmarkStart w:id="48" w:name="十一已经验证过的结果"/>
+    <w:bookmarkEnd w:id="48"/>
+    <w:bookmarkStart w:id="49" w:name="十一已经验证过的结果"/>
     <w:p>
       <w:pPr>
         <w:pStyle w:val="Heading2"/>
@@ -3611,9 +3958,36 @@
         </w:rPr>
         <w:t xml:space="preserve">12. GitHub Pages 部署已验证可以自动更新前端。</w:t>
       </w:r>
-    </w:p>
-    <w:bookmarkEnd w:id="48"/>
-    <w:bookmarkStart w:id="49" w:name="十二当前限制"/>
+      <w:r>
+        <w:br/>
+      </w:r>
+      <w:r>
+        <w:rPr>
+          <w:rStyle w:val="VerbatimChar"/>
+        </w:rPr>
+        <w:t xml:space="preserve">13. 前端已取消“我已完成上传”按钮，改为提示系统自动检测上传状态。</w:t>
+      </w:r>
+      <w:r>
+        <w:br/>
+      </w:r>
+      <w:r>
+        <w:rPr>
+          <w:rStyle w:val="VerbatimChar"/>
+        </w:rPr>
+        <w:t xml:space="preserve">14. Apps Script 已加入 `scanRecentUploadFolders` 自动扫描逻辑，配合 `setupUploadScannerTrigger` 创建 1 分钟定时触发器。</w:t>
+      </w:r>
+      <w:r>
+        <w:br/>
+      </w:r>
+      <w:r>
+        <w:rPr>
+          <w:rStyle w:val="VerbatimChar"/>
+        </w:rPr>
+        <w:t xml:space="preserve">15. Sheet 字段已从 `completed_at` 调整为 `firstDetected_at`，用于记录第一次检测到上传文件的时间。</w:t>
+      </w:r>
+    </w:p>
+    <w:bookmarkEnd w:id="49"/>
+    <w:bookmarkStart w:id="50" w:name="十二当前限制"/>
     <w:p>
       <w:pPr>
         <w:pStyle w:val="Heading2"/>
@@ -3656,16 +4030,16 @@
         <w:rPr>
           <w:rStyle w:val="VerbatimChar"/>
         </w:rPr>
-        <w:t xml:space="preserve">3. 网页无法强制验证用户是否真的上传了文件。</w:t>
-      </w:r>
-      <w:r>
-        <w:br/>
-      </w:r>
-      <w:r>
-        <w:rPr>
-          <w:rStyle w:val="VerbatimChar"/>
-        </w:rPr>
-        <w:t xml:space="preserve">4. 文件扫描和标注发生在用户点击“我已完成上传”之后。</w:t>
+        <w:t xml:space="preserve">3. 网页无法实时强制验证用户是否真的上传了文件。</w:t>
+      </w:r>
+      <w:r>
+        <w:br/>
+      </w:r>
+      <w:r>
+        <w:rPr>
+          <w:rStyle w:val="VerbatimChar"/>
+        </w:rPr>
+        <w:t xml:space="preserve">4. 文件扫描和标注依赖 Apps Script 定时触发器，通常存在 1-2 分钟延迟。</w:t>
       </w:r>
       <w:r>
         <w:br/>
@@ -3683,7 +4057,7 @@
         <w:rPr>
           <w:rStyle w:val="VerbatimChar"/>
         </w:rPr>
-        <w:t xml:space="preserve">6. 如果用户不点击确认，Sheet 状态可能一直停留在 pending_upload。</w:t>
+        <w:t xml:space="preserve">6. 如果 Apps Script 触发器未正确安装或授权失败，Sheet 状态可能一直停留在 pending_upload。</w:t>
       </w:r>
       <w:r>
         <w:br/>
@@ -3721,6 +4095,15 @@
         </w:rPr>
         <w:t xml:space="preserve">10. 邮件通知依赖 Apps Script 的 MailApp 授权和 Google 发送限制。</w:t>
       </w:r>
+      <w:r>
+        <w:br/>
+      </w:r>
+      <w:r>
+        <w:rPr>
+          <w:rStyle w:val="VerbatimChar"/>
+        </w:rPr>
+        <w:t xml:space="preserve">11. 自动扫描默认只处理最近 7 天且 status 为 pending_upload 或 uploaded_detected 的记录，以避免长期累积导致扫描变慢。</w:t>
+      </w:r>
     </w:p>
     <w:p>
       <w:pPr>
@@ -3759,8 +4142,8 @@
         <w:t xml:space="preserve">方案 C：Cloud Storage 直传，再同步到 Drive</w:t>
       </w:r>
     </w:p>
-    <w:bookmarkEnd w:id="49"/>
-    <w:bookmarkStart w:id="53" w:name="十三后续维护流程"/>
+    <w:bookmarkEnd w:id="50"/>
+    <w:bookmarkStart w:id="54" w:name="十三后续维护流程"/>
     <w:p>
       <w:pPr>
         <w:pStyle w:val="Heading2"/>
@@ -3769,7 +4152,7 @@
         <w:t xml:space="preserve">十三、后续维护流程</w:t>
       </w:r>
     </w:p>
-    <w:bookmarkStart w:id="50" w:name="修改网页前端"/>
+    <w:bookmarkStart w:id="51" w:name="修改网页前端"/>
     <w:p>
       <w:pPr>
         <w:pStyle w:val="Heading3"/>
@@ -3836,8 +4219,8 @@
         <w:t xml:space="preserve">，无需手动合并分支。</w:t>
       </w:r>
     </w:p>
-    <w:bookmarkEnd w:id="50"/>
-    <w:bookmarkStart w:id="51" w:name="修改-apps-script"/>
+    <w:bookmarkEnd w:id="51"/>
+    <w:bookmarkStart w:id="52" w:name="修改-apps-script"/>
     <w:p>
       <w:pPr>
         <w:pStyle w:val="Heading3"/>
@@ -3902,8 +4285,8 @@
         <w:t xml:space="preserve">6. 提交并推送代码</w:t>
       </w:r>
     </w:p>
-    <w:bookmarkEnd w:id="51"/>
-    <w:bookmarkStart w:id="52" w:name="修改文档"/>
+    <w:bookmarkEnd w:id="52"/>
+    <w:bookmarkStart w:id="53" w:name="修改文档"/>
     <w:p>
       <w:pPr>
         <w:pStyle w:val="Heading3"/>
@@ -4088,9 +4471,9 @@
         <w:t xml:space="preserve">docx</w:t>
       </w:r>
     </w:p>
-    <w:bookmarkEnd w:id="52"/>
     <w:bookmarkEnd w:id="53"/>
     <w:bookmarkEnd w:id="54"/>
+    <w:bookmarkEnd w:id="55"/>
     <w:sectPr/>
   </w:body>
 </w:document>

</xml_diff>

<commit_message>
Update submission fields for sign language recordings
</commit_message>
<xml_diff>
--- a/docs/simple-drive-link-implementation.docx
+++ b/docs/simple-drive-link-implementation.docx
@@ -460,7 +460,7 @@
         <w:rPr>
           <w:rStyle w:val="VerbatimChar"/>
         </w:rPr>
-        <w:t xml:space="preserve">https://script.google.com/macros/s/AKfycbxgDOx_FhQqFo6ZKUq6wPwBCG-mQVXU0no2eNCq4caMUjABWBAeLYzi8HhoE8aHV7OQ/exec</w:t>
+        <w:t xml:space="preserve">https://script.google.com/macros/s/AKfycbye8zXvdBa7quky_hRriRkSStHp2pMUVmys1B2Vw5OGMjuexL3nUKsUs56SE5X8R49x/exec</w:t>
       </w:r>
     </w:p>
     <w:p>
@@ -687,7 +687,7 @@
         <w:rPr>
           <w:rStyle w:val="VerbatimChar"/>
         </w:rPr>
-        <w:t xml:space="preserve">1. 用户填写姓名、机构/组织、邮箱、国家/地区、其他说明。</w:t>
+        <w:t xml:space="preserve">1. 用户填写 Name、Organization、Contact Information、Country、Sign language used，并可选填写 Personal Bio。</w:t>
       </w:r>
       <w:r>
         <w:br/>
@@ -723,7 +723,7 @@
         <w:rPr>
           <w:rStyle w:val="VerbatimChar"/>
         </w:rPr>
-        <w:t xml:space="preserve">5. Apps Script 将子文件夹设置为“知道链接的任何人可编辑”，并尝试共享给表单邮箱。</w:t>
+        <w:t xml:space="preserve">5. Apps Script 将子文件夹设置为“知道链接的任何人可编辑”，并尝试从 Contact Information 中提取邮箱进行共享。</w:t>
       </w:r>
       <w:r>
         <w:br/>
@@ -827,16 +827,16 @@
         <w:rPr>
           <w:rStyle w:val="VerbatimChar"/>
         </w:rPr>
-        <w:t xml:space="preserve">2. 用户填写姓名、机构/组织、邮箱、国家/地区、其他说明。</w:t>
-      </w:r>
-      <w:r>
-        <w:br/>
-      </w:r>
-      <w:r>
-        <w:rPr>
-          <w:rStyle w:val="VerbatimChar"/>
-        </w:rPr>
-        <w:t xml:space="preserve">3. Mobile 端强制要求邮箱为 Gmail 地址，例如 yourname@gmail.com。</w:t>
+        <w:t xml:space="preserve">2. 用户填写 Name、Organization、Contact Information、Country、Sign language used，并可选填写 Personal Bio。</w:t>
+      </w:r>
+      <w:r>
+        <w:br/>
+      </w:r>
+      <w:r>
+        <w:rPr>
+          <w:rStyle w:val="VerbatimChar"/>
+        </w:rPr>
+        <w:t xml:space="preserve">3. Mobile 端强制要求 Contact Information 中包含 Gmail 地址，例如 yourname@gmail.com。</w:t>
       </w:r>
       <w:r>
         <w:br/>
@@ -1104,13 +1104,13 @@
         <w:t xml:space="preserve">五、前端交互细节</w:t>
       </w:r>
     </w:p>
-    <w:bookmarkStart w:id="32" w:name="必填项和邮箱校验"/>
+    <w:bookmarkStart w:id="32" w:name="必填项和联系方式校验"/>
     <w:p>
       <w:pPr>
         <w:pStyle w:val="Heading3"/>
       </w:pPr>
       <w:r>
-        <w:t xml:space="preserve">1. 必填项和邮箱校验</w:t>
+        <w:t xml:space="preserve">1. 必填项和联系方式校验</w:t>
       </w:r>
     </w:p>
     <w:p>
@@ -1144,42 +1144,85 @@
         <w:rPr>
           <w:rStyle w:val="VerbatimChar"/>
         </w:rPr>
-        <w:t xml:space="preserve">姓名 / Name</w:t>
-      </w:r>
-      <w:r>
-        <w:br/>
-      </w:r>
-      <w:r>
-        <w:rPr>
-          <w:rStyle w:val="VerbatimChar"/>
-        </w:rPr>
-        <w:t xml:space="preserve">机构或组织 / Organization</w:t>
-      </w:r>
-      <w:r>
-        <w:br/>
-      </w:r>
-      <w:r>
-        <w:rPr>
-          <w:rStyle w:val="VerbatimChar"/>
-        </w:rPr>
-        <w:t xml:space="preserve">邮箱 / Email</w:t>
-      </w:r>
-      <w:r>
-        <w:br/>
-      </w:r>
-      <w:r>
-        <w:rPr>
-          <w:rStyle w:val="VerbatimChar"/>
-        </w:rPr>
-        <w:t xml:space="preserve">国家或地区 / Countries</w:t>
-      </w:r>
-    </w:p>
-    <w:p>
-      <w:pPr>
-        <w:pStyle w:val="FirstParagraph"/>
-      </w:pPr>
-      <w:r>
-        <w:t xml:space="preserve">PC 端邮箱项不显示额外提示词，用户可以填写常用邮箱。</w:t>
+        <w:t xml:space="preserve">Name</w:t>
+      </w:r>
+      <w:r>
+        <w:br/>
+      </w:r>
+      <w:r>
+        <w:rPr>
+          <w:rStyle w:val="VerbatimChar"/>
+        </w:rPr>
+        <w:t xml:space="preserve">Organization (School, University, Institution...)</w:t>
+      </w:r>
+      <w:r>
+        <w:br/>
+      </w:r>
+      <w:r>
+        <w:rPr>
+          <w:rStyle w:val="VerbatimChar"/>
+        </w:rPr>
+        <w:t xml:space="preserve">Contact Information (Email/WeChat)</w:t>
+      </w:r>
+      <w:r>
+        <w:br/>
+      </w:r>
+      <w:r>
+        <w:rPr>
+          <w:rStyle w:val="VerbatimChar"/>
+        </w:rPr>
+        <w:t xml:space="preserve">Country</w:t>
+      </w:r>
+      <w:r>
+        <w:br/>
+      </w:r>
+      <w:r>
+        <w:rPr>
+          <w:rStyle w:val="VerbatimChar"/>
+        </w:rPr>
+        <w:t xml:space="preserve">Sign language used</w:t>
+      </w:r>
+    </w:p>
+    <w:p>
+      <w:pPr>
+        <w:pStyle w:val="FirstParagraph"/>
+      </w:pPr>
+      <w:r>
+        <w:t xml:space="preserve">以下字段为选填，但限制在 100 words 以内：</w:t>
+      </w:r>
+    </w:p>
+    <w:p>
+      <w:pPr>
+        <w:pStyle w:val="SourceCode"/>
+      </w:pPr>
+      <w:r>
+        <w:rPr>
+          <w:rStyle w:val="VerbatimChar"/>
+        </w:rPr>
+        <w:t xml:space="preserve">Personal Bio</w:t>
+      </w:r>
+    </w:p>
+    <w:p>
+      <w:pPr>
+        <w:pStyle w:val="FirstParagraph"/>
+      </w:pPr>
+      <w:r>
+        <w:t xml:space="preserve">PC 端</w:t>
+      </w:r>
+      <w:r>
+        <w:t xml:space="preserve"> </w:t>
+      </w:r>
+      <w:r>
+        <w:rPr>
+          <w:rStyle w:val="VerbatimChar"/>
+        </w:rPr>
+        <w:t xml:space="preserve">Contact Information</w:t>
+      </w:r>
+      <w:r>
+        <w:t xml:space="preserve"> </w:t>
+      </w:r>
+      <w:r>
+        <w:t xml:space="preserve">可填写邮箱或微信号。若其中包含邮箱，Apps Script 会尝试把 Drive 上传文件夹直接共享给该邮箱，并发送通知邮件；如果只填写微信号，PC 端仍可通过页面生成的 Drive 上传链接上传。</w:t>
       </w:r>
     </w:p>
     <w:p>
@@ -1187,18 +1230,45 @@
         <w:pStyle w:val="BodyText"/>
       </w:pPr>
       <w:r>
-        <w:t xml:space="preserve">Mobile 端邮箱项显示 Gmail 要求，并强制校验：</w:t>
-      </w:r>
-    </w:p>
-    <w:p>
-      <w:pPr>
-        <w:pStyle w:val="SourceCode"/>
-      </w:pPr>
-      <w:r>
-        <w:rPr>
-          <w:rStyle w:val="VerbatimChar"/>
-        </w:rPr>
-        <w:t xml:space="preserve">邮箱必须是 @gmail.com 地址</w:t>
+        <w:t xml:space="preserve">Mobile 端</w:t>
+      </w:r>
+      <w:r>
+        <w:t xml:space="preserve"> </w:t>
+      </w:r>
+      <w:r>
+        <w:rPr>
+          <w:rStyle w:val="VerbatimChar"/>
+        </w:rPr>
+        <w:t xml:space="preserve">Contact Information</w:t>
+      </w:r>
+      <w:r>
+        <w:t xml:space="preserve"> </w:t>
+      </w:r>
+      <w:r>
+        <w:t xml:space="preserve">必须包含 Gmail 地址，因为手机端推荐流程依赖 Google Drive App 的</w:t>
+      </w:r>
+      <w:r>
+        <w:t xml:space="preserve">“</w:t>
+      </w:r>
+      <w:r>
+        <w:t xml:space="preserve">与我共享</w:t>
+      </w:r>
+      <w:r>
+        <w:t xml:space="preserve">”</w:t>
+      </w:r>
+      <w:r>
+        <w:t xml:space="preserve">：</w:t>
+      </w:r>
+    </w:p>
+    <w:p>
+      <w:pPr>
+        <w:pStyle w:val="SourceCode"/>
+      </w:pPr>
+      <w:r>
+        <w:rPr>
+          <w:rStyle w:val="VerbatimChar"/>
+        </w:rPr>
+        <w:t xml:space="preserve">Contact Information 中必须包含 @gmail.com 地址</w:t>
       </w:r>
       <w:r>
         <w:br/>
@@ -1215,18 +1285,18 @@
         <w:pStyle w:val="FirstParagraph"/>
       </w:pPr>
       <w:r>
-        <w:t xml:space="preserve">如果 Mobile 端用户填写非 Gmail 邮箱，页面会阻止提交并提示：</w:t>
-      </w:r>
-    </w:p>
-    <w:p>
-      <w:pPr>
-        <w:pStyle w:val="SourceCode"/>
-      </w:pPr>
-      <w:r>
-        <w:rPr>
-          <w:rStyle w:val="VerbatimChar"/>
-        </w:rPr>
-        <w:t xml:space="preserve">手机端请填写有效的 Gmail 地址，例如 yourname@gmail.com</w:t>
+        <w:t xml:space="preserve">如果 Mobile 端用户没有填写 Gmail，页面会阻止提交并提示：</w:t>
+      </w:r>
+    </w:p>
+    <w:p>
+      <w:pPr>
+        <w:pStyle w:val="SourceCode"/>
+      </w:pPr>
+      <w:r>
+        <w:rPr>
+          <w:rStyle w:val="VerbatimChar"/>
+        </w:rPr>
+        <w:t xml:space="preserve">手机端联系方式中必须包含有效的 Gmail 地址，例如 yourname@gmail.com</w:t>
       </w:r>
     </w:p>
     <w:bookmarkEnd w:id="32"/>
@@ -1291,7 +1361,16 @@
         <w:rPr>
           <w:rStyle w:val="VerbatimChar"/>
         </w:rPr>
-        <w:t xml:space="preserve">5. Countries 输入框与其他必填输入框保持相同宽度，仍支持搜索匹配国家/地区。</w:t>
+        <w:t xml:space="preserve">5. Country 输入框与其他必填输入框保持相同宽度，仍支持搜索匹配国家。</w:t>
+      </w:r>
+      <w:r>
+        <w:br/>
+      </w:r>
+      <w:r>
+        <w:rPr>
+          <w:rStyle w:val="VerbatimChar"/>
+        </w:rPr>
+        <w:t xml:space="preserve">6. 页面右侧显示 Copyright Notice 卡片，移动端会在页面后部显示。</w:t>
       </w:r>
     </w:p>
     <w:p>
@@ -1819,25 +1898,34 @@
         <w:rPr>
           <w:rStyle w:val="VerbatimChar"/>
         </w:rPr>
-        <w:t xml:space="preserve">email</w:t>
-      </w:r>
-      <w:r>
-        <w:br/>
-      </w:r>
-      <w:r>
-        <w:rPr>
-          <w:rStyle w:val="VerbatimChar"/>
-        </w:rPr>
-        <w:t xml:space="preserve">countries</w:t>
-      </w:r>
-      <w:r>
-        <w:br/>
-      </w:r>
-      <w:r>
-        <w:rPr>
-          <w:rStyle w:val="VerbatimChar"/>
-        </w:rPr>
-        <w:t xml:space="preserve">others</w:t>
+        <w:t xml:space="preserve">contact_info</w:t>
+      </w:r>
+      <w:r>
+        <w:br/>
+      </w:r>
+      <w:r>
+        <w:rPr>
+          <w:rStyle w:val="VerbatimChar"/>
+        </w:rPr>
+        <w:t xml:space="preserve">country</w:t>
+      </w:r>
+      <w:r>
+        <w:br/>
+      </w:r>
+      <w:r>
+        <w:rPr>
+          <w:rStyle w:val="VerbatimChar"/>
+        </w:rPr>
+        <w:t xml:space="preserve">sign_language_used</w:t>
+      </w:r>
+      <w:r>
+        <w:br/>
+      </w:r>
+      <w:r>
+        <w:rPr>
+          <w:rStyle w:val="VerbatimChar"/>
+        </w:rPr>
+        <w:t xml:space="preserve">personal_bio</w:t>
       </w:r>
       <w:r>
         <w:br/>
@@ -1955,6 +2043,60 @@
         <w:rPr>
           <w:rStyle w:val="VerbatimChar"/>
         </w:rPr>
+        <w:t xml:space="preserve">name                用户姓名</w:t>
+      </w:r>
+      <w:r>
+        <w:br/>
+      </w:r>
+      <w:r>
+        <w:rPr>
+          <w:rStyle w:val="VerbatimChar"/>
+        </w:rPr>
+        <w:t xml:space="preserve">organization        学校、大学、机构或组织</w:t>
+      </w:r>
+      <w:r>
+        <w:br/>
+      </w:r>
+      <w:r>
+        <w:rPr>
+          <w:rStyle w:val="VerbatimChar"/>
+        </w:rPr>
+        <w:t xml:space="preserve">contact_info        联系方式，可填写 Email 或 WeChat；如果包含邮箱，脚本会尝试共享 Drive 文件夹和发送邮件</w:t>
+      </w:r>
+      <w:r>
+        <w:br/>
+      </w:r>
+      <w:r>
+        <w:rPr>
+          <w:rStyle w:val="VerbatimChar"/>
+        </w:rPr>
+        <w:t xml:space="preserve">country             国家</w:t>
+      </w:r>
+      <w:r>
+        <w:br/>
+      </w:r>
+      <w:r>
+        <w:rPr>
+          <w:rStyle w:val="VerbatimChar"/>
+        </w:rPr>
+        <w:t xml:space="preserve">sign_language_used  使用的手语，例如 Chinese Sign Language、American Sign Language</w:t>
+      </w:r>
+      <w:r>
+        <w:br/>
+      </w:r>
+      <w:r>
+        <w:rPr>
+          <w:rStyle w:val="VerbatimChar"/>
+        </w:rPr>
+        <w:t xml:space="preserve">personal_bio        个人简介，选填，100 words 以内</w:t>
+      </w:r>
+      <w:r>
+        <w:br/>
+      </w:r>
+      <w:r>
+        <w:rPr>
+          <w:rStyle w:val="VerbatimChar"/>
+        </w:rPr>
         <w:t xml:space="preserve">folder_id           本次提交对应的 Drive 子文件夹 ID</w:t>
       </w:r>
       <w:r>
@@ -2168,6 +2310,82 @@
     <w:p>
       <w:pPr>
         <w:pStyle w:val="BodyText"/>
+      </w:pPr>
+      <w:r>
+        <w:t xml:space="preserve">为了兼容旧表，Apps Script 在运行</w:t>
+      </w:r>
+      <w:r>
+        <w:t xml:space="preserve"> </w:t>
+      </w:r>
+      <w:r>
+        <w:rPr>
+          <w:rStyle w:val="VerbatimChar"/>
+        </w:rPr>
+        <w:t xml:space="preserve">setupSheet()</w:t>
+      </w:r>
+      <w:r>
+        <w:t xml:space="preserve"> </w:t>
+      </w:r>
+      <w:r>
+        <w:t xml:space="preserve">或其他会调用</w:t>
+      </w:r>
+      <w:r>
+        <w:t xml:space="preserve"> </w:t>
+      </w:r>
+      <w:r>
+        <w:rPr>
+          <w:rStyle w:val="VerbatimChar"/>
+        </w:rPr>
+        <w:t xml:space="preserve">getSheet_()</w:t>
+      </w:r>
+      <w:r>
+        <w:t xml:space="preserve"> </w:t>
+      </w:r>
+      <w:r>
+        <w:t xml:space="preserve">的函数时，会自动重命名旧字段：</w:t>
+      </w:r>
+    </w:p>
+    <w:p>
+      <w:pPr>
+        <w:pStyle w:val="SourceCode"/>
+      </w:pPr>
+      <w:r>
+        <w:rPr>
+          <w:rStyle w:val="VerbatimChar"/>
+        </w:rPr>
+        <w:t xml:space="preserve">email       -&gt; contact_info</w:t>
+      </w:r>
+      <w:r>
+        <w:br/>
+      </w:r>
+      <w:r>
+        <w:rPr>
+          <w:rStyle w:val="VerbatimChar"/>
+        </w:rPr>
+        <w:t xml:space="preserve">countries   -&gt; country</w:t>
+      </w:r>
+      <w:r>
+        <w:br/>
+      </w:r>
+      <w:r>
+        <w:rPr>
+          <w:rStyle w:val="VerbatimChar"/>
+        </w:rPr>
+        <w:t xml:space="preserve">others      -&gt; personal_bio</w:t>
+      </w:r>
+      <w:r>
+        <w:br/>
+      </w:r>
+      <w:r>
+        <w:rPr>
+          <w:rStyle w:val="VerbatimChar"/>
+        </w:rPr>
+        <w:t xml:space="preserve">completed_at -&gt; firstDetected_at</w:t>
+      </w:r>
+    </w:p>
+    <w:p>
+      <w:pPr>
+        <w:pStyle w:val="FirstParagraph"/>
       </w:pPr>
       <w:r>
         <w:t xml:space="preserve">当前状态值：</w:t>
@@ -2274,16 +2492,25 @@
         <w:rPr>
           <w:rStyle w:val="VerbatimChar"/>
         </w:rPr>
-        <w:t xml:space="preserve">Email</w:t>
-      </w:r>
-      <w:r>
-        <w:br/>
-      </w:r>
-      <w:r>
-        <w:rPr>
-          <w:rStyle w:val="VerbatimChar"/>
-        </w:rPr>
-        <w:t xml:space="preserve">Countries</w:t>
+        <w:t xml:space="preserve">Contact Information</w:t>
+      </w:r>
+      <w:r>
+        <w:br/>
+      </w:r>
+      <w:r>
+        <w:rPr>
+          <w:rStyle w:val="VerbatimChar"/>
+        </w:rPr>
+        <w:t xml:space="preserve">Country</w:t>
+      </w:r>
+      <w:r>
+        <w:br/>
+      </w:r>
+      <w:r>
+        <w:rPr>
+          <w:rStyle w:val="VerbatimChar"/>
+        </w:rPr>
+        <w:t xml:space="preserve">Sign language used</w:t>
       </w:r>
       <w:r>
         <w:br/>
@@ -2310,7 +2537,7 @@
         <w:rPr>
           <w:rStyle w:val="VerbatimChar"/>
         </w:rPr>
-        <w:t xml:space="preserve">Other notes</w:t>
+        <w:t xml:space="preserve">Personal Bio</w:t>
       </w:r>
     </w:p>
     <w:p>
@@ -2338,15 +2565,15 @@
         <w:rPr>
           <w:rStyle w:val="VerbatimChar"/>
         </w:rPr>
-        <w:t xml:space="preserve">2. folder.addEditor(request.email)</w:t>
-      </w:r>
-    </w:p>
-    <w:p>
-      <w:pPr>
-        <w:pStyle w:val="FirstParagraph"/>
-      </w:pPr>
-      <w:r>
-        <w:t xml:space="preserve">第一步用于保留 PC 端通过链接上传的能力。第二步用于把子文件夹直接共享给用户填写的邮箱，尤其方便 Mobile 用户在 Google Drive App 的</w:t>
+        <w:t xml:space="preserve">2. 如果 Contact Information 中包含邮箱，folder.addEditor(email)</w:t>
+      </w:r>
+    </w:p>
+    <w:p>
+      <w:pPr>
+        <w:pStyle w:val="FirstParagraph"/>
+      </w:pPr>
+      <w:r>
+        <w:t xml:space="preserve">第一步用于保留 PC 端通过链接上传的能力。第二步用于把子文件夹直接共享给 Contact Information 中提取到的邮箱，尤其方便 Mobile 用户在 Google Drive App 的</w:t>
       </w:r>
       <w:r>
         <w:t xml:space="preserve">“</w:t>
@@ -2366,7 +2593,7 @@
         <w:pStyle w:val="BodyText"/>
       </w:pPr>
       <w:r>
-        <w:t xml:space="preserve">脚本还会尝试向用户填写的邮箱发送一封通知邮件，邮件中包含：</w:t>
+        <w:t xml:space="preserve">如果 Contact Information 中包含邮箱，脚本还会尝试向该邮箱发送一封通知邮件，邮件中包含：</w:t>
       </w:r>
     </w:p>
     <w:p>
@@ -2403,7 +2630,7 @@
         <w:pStyle w:val="FirstParagraph"/>
       </w:pPr>
       <w:r>
-        <w:t xml:space="preserve">注意：如果邮箱不是有效 Google/Gmail 账号、Workspace 管理员限制共享、或 MailApp 权限未授权，共享或邮件可能失败。失败不会阻止提交记录创建，但会写入</w:t>
+        <w:t xml:space="preserve">注意：如果 Contact Information 中没有邮箱、邮箱不是有效 Google/Gmail 账号、Workspace 管理员限制共享、或 MailApp 权限未授权，共享或邮件可能失败或跳过。失败不会阻止提交记录创建，但会写入</w:t>
       </w:r>
       <w:r>
         <w:t xml:space="preserve"> </w:t>
@@ -3277,6 +3504,69 @@
         <w:rPr>
           <w:rStyle w:val="NormalTok"/>
         </w:rPr>
+        <w:t xml:space="preserve"> sharingEmail </w:t>
+      </w:r>
+      <w:r>
+        <w:rPr>
+          <w:rStyle w:val="OperatorTok"/>
+        </w:rPr>
+        <w:t xml:space="preserve">=</w:t>
+      </w:r>
+      <w:r>
+        <w:rPr>
+          <w:rStyle w:val="NormalTok"/>
+        </w:rPr>
+        <w:t xml:space="preserve"> </w:t>
+      </w:r>
+      <w:r>
+        <w:rPr>
+          <w:rStyle w:val="FunctionTok"/>
+        </w:rPr>
+        <w:t xml:space="preserve">extractEmail_</w:t>
+      </w:r>
+      <w:r>
+        <w:rPr>
+          <w:rStyle w:val="NormalTok"/>
+        </w:rPr>
+        <w:t xml:space="preserve">(normalized</w:t>
+      </w:r>
+      <w:r>
+        <w:rPr>
+          <w:rStyle w:val="OperatorTok"/>
+        </w:rPr>
+        <w:t xml:space="preserve">.</w:t>
+      </w:r>
+      <w:r>
+        <w:rPr>
+          <w:rStyle w:val="AttributeTok"/>
+        </w:rPr>
+        <w:t xml:space="preserve">contactInfo</w:t>
+      </w:r>
+      <w:r>
+        <w:rPr>
+          <w:rStyle w:val="NormalTok"/>
+        </w:rPr>
+        <w:t xml:space="preserve">)</w:t>
+      </w:r>
+      <w:r>
+        <w:rPr>
+          <w:rStyle w:val="OperatorTok"/>
+        </w:rPr>
+        <w:t xml:space="preserve">;</w:t>
+      </w:r>
+      <w:r>
+        <w:br/>
+      </w:r>
+      <w:r>
+        <w:rPr>
+          <w:rStyle w:val="KeywordTok"/>
+        </w:rPr>
+        <w:t xml:space="preserve">const</w:t>
+      </w:r>
+      <w:r>
+        <w:rPr>
+          <w:rStyle w:val="NormalTok"/>
+        </w:rPr>
         <w:t xml:space="preserve"> sharingNote </w:t>
       </w:r>
       <w:r>
@@ -3313,19 +3603,19 @@
         <w:rPr>
           <w:rStyle w:val="NormalTok"/>
         </w:rPr>
-        <w:t xml:space="preserve"> request</w:t>
+        <w:t xml:space="preserve"> sharingEmail</w:t>
       </w:r>
       <w:r>
         <w:rPr>
           <w:rStyle w:val="OperatorTok"/>
         </w:rPr>
-        <w:t xml:space="preserve">.</w:t>
-      </w:r>
-      <w:r>
-        <w:rPr>
-          <w:rStyle w:val="AttributeTok"/>
-        </w:rPr>
-        <w:t xml:space="preserve">email</w:t>
+        <w:t xml:space="preserve">,</w:t>
+      </w:r>
+      <w:r>
+        <w:rPr>
+          <w:rStyle w:val="NormalTok"/>
+        </w:rPr>
+        <w:t xml:space="preserve"> folderUrl</w:t>
       </w:r>
       <w:r>
         <w:rPr>
@@ -3337,24 +3627,12 @@
         <w:rPr>
           <w:rStyle w:val="NormalTok"/>
         </w:rPr>
-        <w:t xml:space="preserve"> folderUrl</w:t>
+        <w:t xml:space="preserve"> submissionId)</w:t>
       </w:r>
       <w:r>
         <w:rPr>
           <w:rStyle w:val="OperatorTok"/>
         </w:rPr>
-        <w:t xml:space="preserve">,</w:t>
-      </w:r>
-      <w:r>
-        <w:rPr>
-          <w:rStyle w:val="NormalTok"/>
-        </w:rPr>
-        <w:t xml:space="preserve"> submissionId)</w:t>
-      </w:r>
-      <w:r>
-        <w:rPr>
-          <w:rStyle w:val="OperatorTok"/>
-        </w:rPr>
         <w:t xml:space="preserve">;</w:t>
       </w:r>
     </w:p>
@@ -3383,25 +3661,25 @@
         <w:rPr>
           <w:rStyle w:val="VerbatimChar"/>
         </w:rPr>
-        <w:t xml:space="preserve">1. 读取表单 email。</w:t>
-      </w:r>
-      <w:r>
-        <w:br/>
-      </w:r>
-      <w:r>
-        <w:rPr>
-          <w:rStyle w:val="VerbatimChar"/>
-        </w:rPr>
-        <w:t xml:space="preserve">2. 调用 folder.addEditor(email)，把上传子文件夹直接共享给该邮箱。</w:t>
-      </w:r>
-      <w:r>
-        <w:br/>
-      </w:r>
-      <w:r>
-        <w:rPr>
-          <w:rStyle w:val="VerbatimChar"/>
-        </w:rPr>
-        <w:t xml:space="preserve">3. 调用 MailApp.sendEmail(email, ...)，发送上传文件夹链接。</w:t>
+        <w:t xml:space="preserve">1. 从表单 Contact Information 中提取邮箱。</w:t>
+      </w:r>
+      <w:r>
+        <w:br/>
+      </w:r>
+      <w:r>
+        <w:rPr>
+          <w:rStyle w:val="VerbatimChar"/>
+        </w:rPr>
+        <w:t xml:space="preserve">2. 如果提取到邮箱，调用 folder.addEditor(email)，把上传子文件夹直接共享给该邮箱。</w:t>
+      </w:r>
+      <w:r>
+        <w:br/>
+      </w:r>
+      <w:r>
+        <w:rPr>
+          <w:rStyle w:val="VerbatimChar"/>
+        </w:rPr>
+        <w:t xml:space="preserve">3. 如果提取到邮箱，调用 MailApp.sendEmail(email, ...)，发送上传文件夹链接。</w:t>
       </w:r>
       <w:r>
         <w:br/>

</xml_diff>